<commit_message>
Linux lab: 4-person video script and group names on report
Co-Authored-By: Claude Opus 5.5 <noreply@anthropic.com>
Claude-Session: https://claude.ai/code/session_014ocBApjQjQLvNFavUdK8Yx
</commit_message>
<xml_diff>
--- a/linux-lab/Linux_Lab_Report.docx
+++ b/linux-lab/Linux_Lab_Report.docx
@@ -89,7 +89,7 @@
               <w:jc w:val="left"/>
             </w:pPr>
             <w:r>
-              <w:t xml:space="preserve">[Name 1]</w:t>
+              <w:t xml:space="preserve">Bilal [Last name]</w:t>
             </w:r>
           </w:p>
         </w:tc>
@@ -115,7 +115,7 @@
               <w:jc w:val="left"/>
             </w:pPr>
             <w:r>
-              <w:t xml:space="preserve">[Name 2]</w:t>
+              <w:t xml:space="preserve">Ali [Last name]</w:t>
             </w:r>
           </w:p>
         </w:tc>
@@ -141,7 +141,33 @@
               <w:jc w:val="left"/>
             </w:pPr>
             <w:r>
-              <w:t xml:space="preserve">[Name 3]</w:t>
+              <w:t xml:space="preserve">Merat [Last name]</w:t>
+            </w:r>
+          </w:p>
+        </w:tc>
+        <w:tc>
+          <w:tcPr/>
+          <w:p>
+            <w:pPr>
+              <w:pStyle w:val="Compact"/>
+              <w:jc w:val="left"/>
+            </w:pPr>
+            <w:r>
+              <w:t xml:space="preserve">[DU-ID]</w:t>
+            </w:r>
+          </w:p>
+        </w:tc>
+      </w:tr>
+      <w:tr>
+        <w:tc>
+          <w:tcPr/>
+          <w:p>
+            <w:pPr>
+              <w:pStyle w:val="Compact"/>
+              <w:jc w:val="left"/>
+            </w:pPr>
+            <w:r>
+              <w:t xml:space="preserve">Hussein [Last name]</w:t>
             </w:r>
           </w:p>
         </w:tc>
@@ -165,6 +191,24 @@
       </w:pPr>
       <w:r>
         <w:t xml:space="preserve">Video presentation: [YouTube link]</w:t>
+      </w:r>
+    </w:p>
+    <w:p>
+      <w:pPr>
+        <w:pStyle w:val="BodyText"/>
+      </w:pPr>
+      <w:r>
+        <w:rPr>
+          <w:bCs/>
+          <w:b/>
+        </w:rPr>
+        <w:t xml:space="preserve">Video presentation, division of work:</w:t>
+      </w:r>
+      <w:r>
+        <w:t xml:space="preserve"> </w:t>
+      </w:r>
+      <w:r>
+        <w:t xml:space="preserve">Bilal – introduction and Part 1 tasks 1–3 · Ali – Part 1 tasks 4–5 · Merat – Part 1 task 6 and the Part 2 script code · Hussein – running and testing the Part 2 script.</w:t>
       </w:r>
     </w:p>
     <w:bookmarkEnd w:id="20"/>

</xml_diff>

<commit_message>
Rewrite report in simpler language following the teacher's format
Co-Authored-By: Claude Opus 5.5 <noreply@anthropic.com>
Claude-Session: https://claude.ai/code/session_014ocBApjQjQLvNFavUdK8Yx
</commit_message>
<xml_diff>
--- a/linux-lab/Linux_Lab_Report.docx
+++ b/linux-lab/Linux_Lab_Report.docx
@@ -29,6 +29,12 @@
           <w:bCs/>
           <w:b/>
         </w:rPr>
+        <w:t xml:space="preserve">Course:</w:t>
+      </w:r>
+      <w:r>
+        <w:t xml:space="preserve"> </w:t>
+      </w:r>
+      <w:r>
         <w:t xml:space="preserve">GIK2NV – Data storage and management technologies</w:t>
       </w:r>
     </w:p>
@@ -37,7 +43,17 @@
         <w:pStyle w:val="BodyText"/>
       </w:pPr>
       <w:r>
-        <w:t xml:space="preserve">Date: [DATE]</w:t>
+        <w:rPr>
+          <w:bCs/>
+          <w:b/>
+        </w:rPr>
+        <w:t xml:space="preserve">Date:</w:t>
+      </w:r>
+      <w:r>
+        <w:t xml:space="preserve"> </w:t>
+      </w:r>
+      <w:r>
+        <w:t xml:space="preserve">[DATE]</w:t>
       </w:r>
     </w:p>
     <w:tbl>
@@ -63,7 +79,7 @@
               <w:jc w:val="left"/>
             </w:pPr>
             <w:r>
-              <w:t xml:space="preserve">Name</w:t>
+              <w:t xml:space="preserve">Student</w:t>
             </w:r>
           </w:p>
         </w:tc>
@@ -190,36 +206,28 @@
         <w:pStyle w:val="BodyText"/>
       </w:pPr>
       <w:r>
-        <w:t xml:space="preserve">Video presentation: [YouTube link]</w:t>
-      </w:r>
-    </w:p>
-    <w:p>
-      <w:pPr>
-        <w:pStyle w:val="BodyText"/>
-      </w:pPr>
-      <w:r>
-        <w:rPr>
-          <w:bCs/>
-          <w:b/>
-        </w:rPr>
-        <w:t xml:space="preserve">Video presentation, division of work:</w:t>
-      </w:r>
-      <w:r>
-        <w:t xml:space="preserve"> </w:t>
-      </w:r>
-      <w:r>
-        <w:t xml:space="preserve">Bilal – introduction and Part 1 tasks 1–3 · Ali – Part 1 tasks 4–5 · Merat – Part 1 task 6 and the Part 2 script code · Hussein – running and testing the Part 2 script.</w:t>
+        <w:rPr>
+          <w:bCs/>
+          <w:b/>
+        </w:rPr>
+        <w:t xml:space="preserve">Video presentation:</w:t>
+      </w:r>
+      <w:r>
+        <w:t xml:space="preserve"> </w:t>
+      </w:r>
+      <w:r>
+        <w:t xml:space="preserve">[YouTube link]</w:t>
       </w:r>
     </w:p>
     <w:bookmarkEnd w:id="20"/>
     <w:bookmarkEnd w:id="21"/>
-    <w:bookmarkStart w:id="22" w:name="laboratory-environment"/>
+    <w:bookmarkStart w:id="22" w:name="introduction"/>
     <w:p>
       <w:pPr>
         <w:pStyle w:val="Heading1"/>
       </w:pPr>
       <w:r>
-        <w:t xml:space="preserve">Laboratory environment</w:t>
+        <w:t xml:space="preserve">Introduction</w:t>
       </w:r>
     </w:p>
     <w:p>
@@ -227,35 +235,123 @@
         <w:pStyle w:val="FirstParagraph"/>
       </w:pPr>
       <w:r>
-        <w:t xml:space="preserve">The lab was carried out on</w:t>
-      </w:r>
-      <w:r>
-        <w:t xml:space="preserve"> </w:t>
-      </w:r>
-      <w:r>
-        <w:rPr>
-          <w:bCs/>
-          <w:b/>
-        </w:rPr>
-        <w:t xml:space="preserve">Ubuntu 24.04 LTS</w:t>
-      </w:r>
-      <w:r>
-        <w:t xml:space="preserve"> </w:t>
-      </w:r>
-      <w:r>
-        <w:t xml:space="preserve">(hostname</w:t>
-      </w:r>
-      <w:r>
-        <w:t xml:space="preserve"> </w:t>
-      </w:r>
-      <w:r>
-        <w:rPr>
-          <w:rStyle w:val="VerbatimChar"/>
-        </w:rPr>
-        <w:t xml:space="preserve">linux-lab</w:t>
-      </w:r>
-      <w:r>
-        <w:t xml:space="preserve">). All administrative commands are run as</w:t>
+        <w:t xml:space="preserve">In this lab we act as Linux administrators for a company. The company has three new departments:</w:t>
+      </w:r>
+      <w:r>
+        <w:t xml:space="preserve"> </w:t>
+      </w:r>
+      <w:r>
+        <w:rPr>
+          <w:bCs/>
+          <w:b/>
+        </w:rPr>
+        <w:t xml:space="preserve">Engineering</w:t>
+      </w:r>
+      <w:r>
+        <w:t xml:space="preserve">,</w:t>
+      </w:r>
+      <w:r>
+        <w:t xml:space="preserve"> </w:t>
+      </w:r>
+      <w:r>
+        <w:rPr>
+          <w:bCs/>
+          <w:b/>
+        </w:rPr>
+        <w:t xml:space="preserve">Sales</w:t>
+      </w:r>
+      <w:r>
+        <w:t xml:space="preserve"> </w:t>
+      </w:r>
+      <w:r>
+        <w:t xml:space="preserve">and</w:t>
+      </w:r>
+      <w:r>
+        <w:t xml:space="preserve"> </w:t>
+      </w:r>
+      <w:r>
+        <w:rPr>
+          <w:bCs/>
+          <w:b/>
+        </w:rPr>
+        <w:t xml:space="preserve">HR</w:t>
+      </w:r>
+      <w:r>
+        <w:t xml:space="preserve">.</w:t>
+      </w:r>
+    </w:p>
+    <w:p>
+      <w:pPr>
+        <w:numPr>
+          <w:ilvl w:val="0"/>
+          <w:numId w:val="1001"/>
+        </w:numPr>
+        <w:pStyle w:val="Compact"/>
+      </w:pPr>
+      <w:r>
+        <w:t xml:space="preserve">In</w:t>
+      </w:r>
+      <w:r>
+        <w:t xml:space="preserve"> </w:t>
+      </w:r>
+      <w:r>
+        <w:rPr>
+          <w:bCs/>
+          <w:b/>
+        </w:rPr>
+        <w:t xml:space="preserve">Part 1</w:t>
+      </w:r>
+      <w:r>
+        <w:t xml:space="preserve"> </w:t>
+      </w:r>
+      <w:r>
+        <w:t xml:space="preserve">we create folders, groups, users and permissions for the departments, one command at a time.</w:t>
+      </w:r>
+    </w:p>
+    <w:p>
+      <w:pPr>
+        <w:numPr>
+          <w:ilvl w:val="0"/>
+          <w:numId w:val="1001"/>
+        </w:numPr>
+        <w:pStyle w:val="Compact"/>
+      </w:pPr>
+      <w:r>
+        <w:t xml:space="preserve">In</w:t>
+      </w:r>
+      <w:r>
+        <w:t xml:space="preserve"> </w:t>
+      </w:r>
+      <w:r>
+        <w:rPr>
+          <w:bCs/>
+          <w:b/>
+        </w:rPr>
+        <w:t xml:space="preserve">Part 2</w:t>
+      </w:r>
+      <w:r>
+        <w:t xml:space="preserve"> </w:t>
+      </w:r>
+      <w:r>
+        <w:t xml:space="preserve">we write a Bash script that does the same kind of work automatically, for any user and group name.</w:t>
+      </w:r>
+    </w:p>
+    <w:p>
+      <w:pPr>
+        <w:pStyle w:val="FirstParagraph"/>
+      </w:pPr>
+      <w:r>
+        <w:rPr>
+          <w:bCs/>
+          <w:b/>
+        </w:rPr>
+        <w:t xml:space="preserve">Environment:</w:t>
+      </w:r>
+      <w:r>
+        <w:t xml:space="preserve"> </w:t>
+      </w:r>
+      <w:r>
+        <w:t xml:space="preserve">Ubuntu Linux. All commands are run as the</w:t>
       </w:r>
       <w:r>
         <w:t xml:space="preserve"> </w:t>
@@ -270,7 +366,7 @@
         <w:t xml:space="preserve"> </w:t>
       </w:r>
       <w:r>
-        <w:t xml:space="preserve">(on a normal user account, put</w:t>
+        <w:t xml:space="preserve">user (on a normal account, put</w:t>
       </w:r>
       <w:r>
         <w:t xml:space="preserve"> </w:t>
@@ -285,7 +381,19 @@
         <w:t xml:space="preserve"> </w:t>
       </w:r>
       <w:r>
-        <w:t xml:space="preserve">in front of each command). The users and groups below were used in Part 1:</w:t>
+        <w:t xml:space="preserve">in front of each command).</w:t>
+      </w:r>
+    </w:p>
+    <w:p>
+      <w:pPr>
+        <w:pStyle w:val="BodyText"/>
+      </w:pPr>
+      <w:r>
+        <w:rPr>
+          <w:bCs/>
+          <w:b/>
+        </w:rPr>
+        <w:t xml:space="preserve">Names we used:</w:t>
       </w:r>
     </w:p>
     <w:tbl>
@@ -337,7 +445,7 @@
               <w:jc w:val="left"/>
             </w:pPr>
             <w:r>
-              <w:t xml:space="preserve">Administrator</w:t>
+              <w:t xml:space="preserve">Admin</w:t>
             </w:r>
           </w:p>
         </w:tc>
@@ -512,7 +620,7 @@
         <w:pStyle w:val="Heading1"/>
       </w:pPr>
       <w:r>
-        <w:t xml:space="preserve">Part 1 – User Management</w:t>
+        <w:t xml:space="preserve">Part 1 – User management</w:t>
       </w:r>
     </w:p>
     <w:bookmarkStart w:id="26" w:name="Xebe5525468a91d0fad27da1f202305f56f6f32b"/>
@@ -529,6 +637,16 @@
         <w:pStyle w:val="FirstParagraph"/>
       </w:pPr>
       <w:r>
+        <w:rPr>
+          <w:bCs/>
+          <w:b/>
+        </w:rPr>
+        <w:t xml:space="preserve">How we did it:</w:t>
+      </w:r>
+      <w:r>
+        <w:t xml:space="preserve"> </w:t>
+      </w:r>
+      <w:r>
         <w:t xml:space="preserve">We go to the root of the file system with</w:t>
       </w:r>
       <w:r>
@@ -541,10 +659,7 @@
         <w:t xml:space="preserve">cd /</w:t>
       </w:r>
       <w:r>
-        <w:t xml:space="preserve"> </w:t>
-      </w:r>
-      <w:r>
-        <w:t xml:space="preserve">and use</w:t>
+        <w:t xml:space="preserve">. Then we create one folder per department with</w:t>
       </w:r>
       <w:r>
         <w:t xml:space="preserve"> </w:t>
@@ -556,10 +671,51 @@
         <w:t xml:space="preserve">mkdir</w:t>
       </w:r>
       <w:r>
-        <w:t xml:space="preserve"> </w:t>
-      </w:r>
-      <w:r>
-        <w:t xml:space="preserve">to create one directory per department, each named after its department.</w:t>
+        <w:t xml:space="preserve">. Each folder has the same name as its department.</w:t>
+      </w:r>
+    </w:p>
+    <w:p>
+      <w:pPr>
+        <w:pStyle w:val="BodyText"/>
+      </w:pPr>
+      <w:r>
+        <w:rPr>
+          <w:bCs/>
+          <w:b/>
+        </w:rPr>
+        <w:t xml:space="preserve">Code:</w:t>
+      </w:r>
+    </w:p>
+    <w:p>
+      <w:pPr>
+        <w:pStyle w:val="SourceCode"/>
+      </w:pPr>
+      <w:r>
+        <w:rPr>
+          <w:rStyle w:val="VerbatimChar"/>
+        </w:rPr>
+        <w:t xml:space="preserve">cd /</w:t>
+      </w:r>
+      <w:r>
+        <w:br/>
+      </w:r>
+      <w:r>
+        <w:rPr>
+          <w:rStyle w:val="VerbatimChar"/>
+        </w:rPr>
+        <w:t xml:space="preserve">mkdir /Engineering /Sales /HR</w:t>
+      </w:r>
+    </w:p>
+    <w:p>
+      <w:pPr>
+        <w:pStyle w:val="FirstParagraph"/>
+      </w:pPr>
+      <w:r>
+        <w:rPr>
+          <w:bCs/>
+          <w:b/>
+        </w:rPr>
+        <w:t xml:space="preserve">Verification:</w:t>
       </w:r>
       <w:r>
         <w:t xml:space="preserve"> </w:t>
@@ -574,7 +730,7 @@
         <w:t xml:space="preserve"> </w:t>
       </w:r>
       <w:r>
-        <w:t xml:space="preserve">verifies that the three directories exist directly under</w:t>
+        <w:t xml:space="preserve">shows that the three folders exist under</w:t>
       </w:r>
       <w:r>
         <w:t xml:space="preserve"> </w:t>
@@ -652,15 +808,81 @@
       </w:pPr>
       <w:r>
         <w:rPr>
+          <w:bCs/>
+          <w:b/>
+        </w:rPr>
+        <w:t xml:space="preserve">How we did it:</w:t>
+      </w:r>
+      <w:r>
+        <w:t xml:space="preserve"> </w:t>
+      </w:r>
+      <w:r>
+        <w:t xml:space="preserve">We create one group per department with</w:t>
+      </w:r>
+      <w:r>
+        <w:t xml:space="preserve"> </w:t>
+      </w:r>
+      <w:r>
+        <w:rPr>
           <w:rStyle w:val="VerbatimChar"/>
         </w:rPr>
         <w:t xml:space="preserve">groupadd</w:t>
       </w:r>
       <w:r>
-        <w:t xml:space="preserve"> </w:t>
-      </w:r>
-      <w:r>
-        <w:t xml:space="preserve">creates one group per department, each named after its department.</w:t>
+        <w:t xml:space="preserve">. Each group has the same name as its department.</w:t>
+      </w:r>
+    </w:p>
+    <w:p>
+      <w:pPr>
+        <w:pStyle w:val="BodyText"/>
+      </w:pPr>
+      <w:r>
+        <w:rPr>
+          <w:bCs/>
+          <w:b/>
+        </w:rPr>
+        <w:t xml:space="preserve">Code:</w:t>
+      </w:r>
+    </w:p>
+    <w:p>
+      <w:pPr>
+        <w:pStyle w:val="SourceCode"/>
+      </w:pPr>
+      <w:r>
+        <w:rPr>
+          <w:rStyle w:val="VerbatimChar"/>
+        </w:rPr>
+        <w:t xml:space="preserve">groupadd Engineering</w:t>
+      </w:r>
+      <w:r>
+        <w:br/>
+      </w:r>
+      <w:r>
+        <w:rPr>
+          <w:rStyle w:val="VerbatimChar"/>
+        </w:rPr>
+        <w:t xml:space="preserve">groupadd Sales</w:t>
+      </w:r>
+      <w:r>
+        <w:br/>
+      </w:r>
+      <w:r>
+        <w:rPr>
+          <w:rStyle w:val="VerbatimChar"/>
+        </w:rPr>
+        <w:t xml:space="preserve">groupadd HR</w:t>
+      </w:r>
+    </w:p>
+    <w:p>
+      <w:pPr>
+        <w:pStyle w:val="FirstParagraph"/>
+      </w:pPr>
+      <w:r>
+        <w:rPr>
+          <w:bCs/>
+          <w:b/>
+        </w:rPr>
+        <w:t xml:space="preserve">Verification:</w:t>
       </w:r>
       <w:r>
         <w:t xml:space="preserve"> </w:t>
@@ -675,7 +897,7 @@
         <w:t xml:space="preserve"> </w:t>
       </w:r>
       <w:r>
-        <w:t xml:space="preserve">verifies that the groups exist in</w:t>
+        <w:t xml:space="preserve">shows that the groups exist in</w:t>
       </w:r>
       <w:r>
         <w:t xml:space="preserve"> </w:t>
@@ -753,22 +975,35 @@
       </w:pPr>
       <w:r>
         <w:rPr>
+          <w:bCs/>
+          <w:b/>
+        </w:rPr>
+        <w:t xml:space="preserve">How we did it:</w:t>
+      </w:r>
+      <w:r>
+        <w:t xml:space="preserve"> </w:t>
+      </w:r>
+      <w:r>
+        <w:t xml:space="preserve">We create one admin per department with</w:t>
+      </w:r>
+      <w:r>
+        <w:t xml:space="preserve"> </w:t>
+      </w:r>
+      <w:r>
+        <w:rPr>
           <w:rStyle w:val="VerbatimChar"/>
         </w:rPr>
         <w:t xml:space="preserve">useradd</w:t>
       </w:r>
       <w:r>
-        <w:t xml:space="preserve"> </w:t>
-      </w:r>
-      <w:r>
-        <w:t xml:space="preserve">creates the three administrators:</w:t>
+        <w:t xml:space="preserve">:</w:t>
       </w:r>
     </w:p>
     <w:p>
       <w:pPr>
         <w:numPr>
           <w:ilvl w:val="0"/>
-          <w:numId w:val="1001"/>
+          <w:numId w:val="1002"/>
         </w:numPr>
         <w:pStyle w:val="Compact"/>
       </w:pPr>
@@ -782,14 +1017,14 @@
         <w:t xml:space="preserve"> </w:t>
       </w:r>
       <w:r>
-        <w:t xml:space="preserve">creates a home directory,</w:t>
+        <w:t xml:space="preserve">creates a home folder for the user.</w:t>
       </w:r>
     </w:p>
     <w:p>
       <w:pPr>
         <w:numPr>
           <w:ilvl w:val="0"/>
-          <w:numId w:val="1001"/>
+          <w:numId w:val="1002"/>
         </w:numPr>
         <w:pStyle w:val="Compact"/>
       </w:pPr>
@@ -819,14 +1054,14 @@
         <w:t xml:space="preserve"> </w:t>
       </w:r>
       <w:r>
-        <w:t xml:space="preserve">(3a),</w:t>
+        <w:t xml:space="preserve">(3a).</w:t>
       </w:r>
     </w:p>
     <w:p>
       <w:pPr>
         <w:numPr>
           <w:ilvl w:val="0"/>
-          <w:numId w:val="1001"/>
+          <w:numId w:val="1002"/>
         </w:numPr>
         <w:pStyle w:val="Compact"/>
       </w:pPr>
@@ -840,7 +1075,7 @@
         <w:t xml:space="preserve"> </w:t>
       </w:r>
       <w:r>
-        <w:t xml:space="preserve">sets the department group as the user’s</w:t>
+        <w:t xml:space="preserve">makes the department group the user’s</w:t>
       </w:r>
       <w:r>
         <w:t xml:space="preserve"> </w:t>
@@ -865,6 +1100,63 @@
       </w:pPr>
       <w:r>
         <w:rPr>
+          <w:bCs/>
+          <w:b/>
+        </w:rPr>
+        <w:t xml:space="preserve">Code:</w:t>
+      </w:r>
+    </w:p>
+    <w:p>
+      <w:pPr>
+        <w:pStyle w:val="SourceCode"/>
+      </w:pPr>
+      <w:r>
+        <w:rPr>
+          <w:rStyle w:val="VerbatimChar"/>
+        </w:rPr>
+        <w:t xml:space="preserve">useradd -m -s /bin/bash -g Engineering eng_admin</w:t>
+      </w:r>
+      <w:r>
+        <w:br/>
+      </w:r>
+      <w:r>
+        <w:rPr>
+          <w:rStyle w:val="VerbatimChar"/>
+        </w:rPr>
+        <w:t xml:space="preserve">useradd -m -s /bin/bash -g Sales sales_admin</w:t>
+      </w:r>
+      <w:r>
+        <w:br/>
+      </w:r>
+      <w:r>
+        <w:rPr>
+          <w:rStyle w:val="VerbatimChar"/>
+        </w:rPr>
+        <w:t xml:space="preserve">useradd -m -s /bin/bash -g HR hr_admin</w:t>
+      </w:r>
+    </w:p>
+    <w:p>
+      <w:pPr>
+        <w:pStyle w:val="FirstParagraph"/>
+      </w:pPr>
+      <w:r>
+        <w:rPr>
+          <w:bCs/>
+          <w:b/>
+        </w:rPr>
+        <w:t xml:space="preserve">Verification:</w:t>
+      </w:r>
+    </w:p>
+    <w:p>
+      <w:pPr>
+        <w:numPr>
+          <w:ilvl w:val="0"/>
+          <w:numId w:val="1003"/>
+        </w:numPr>
+        <w:pStyle w:val="Compact"/>
+      </w:pPr>
+      <w:r>
+        <w:rPr>
           <w:rStyle w:val="VerbatimChar"/>
         </w:rPr>
         <w:t xml:space="preserve">id</w:t>
@@ -882,11 +1174,17 @@
         <w:t xml:space="preserve">gid</w:t>
       </w:r>
       <w:r>
-        <w:t xml:space="preserve">) is the department group, and</w:t>
-      </w:r>
-      <w:r>
-        <w:t xml:space="preserve"> </w:t>
-      </w:r>
+        <w:t xml:space="preserve">) is the department group.</w:t>
+      </w:r>
+    </w:p>
+    <w:p>
+      <w:pPr>
+        <w:numPr>
+          <w:ilvl w:val="0"/>
+          <w:numId w:val="1003"/>
+        </w:numPr>
+        <w:pStyle w:val="Compact"/>
+      </w:pPr>
       <w:r>
         <w:rPr>
           <w:rStyle w:val="VerbatimChar"/>
@@ -914,7 +1212,7 @@
     </w:p>
     <w:p>
       <w:pPr>
-        <w:pStyle w:val="BodyText"/>
+        <w:pStyle w:val="FirstParagraph"/>
       </w:pPr>
       <w:r>
         <w:drawing>
@@ -974,22 +1272,97 @@
         <w:pStyle w:val="FirstParagraph"/>
       </w:pPr>
       <w:r>
-        <w:t xml:space="preserve">The same</w:t>
-      </w:r>
-      <w:r>
-        <w:t xml:space="preserve"> </w:t>
-      </w:r>
-      <w:r>
-        <w:rPr>
-          <w:rStyle w:val="VerbatimChar"/>
-        </w:rPr>
-        <w:t xml:space="preserve">useradd</w:t>
-      </w:r>
-      <w:r>
-        <w:t xml:space="preserve"> </w:t>
-      </w:r>
-      <w:r>
-        <w:t xml:space="preserve">options give each regular user a Bash login shell (4a) and the department group as primary group (4b). The output of</w:t>
+        <w:rPr>
+          <w:bCs/>
+          <w:b/>
+        </w:rPr>
+        <w:t xml:space="preserve">How we did it:</w:t>
+      </w:r>
+      <w:r>
+        <w:t xml:space="preserve"> </w:t>
+      </w:r>
+      <w:r>
+        <w:t xml:space="preserve">We create two normal users per department, with the same options as the admins: a Bash login shell (4a) and the department as primary group (4b).</w:t>
+      </w:r>
+    </w:p>
+    <w:p>
+      <w:pPr>
+        <w:pStyle w:val="BodyText"/>
+      </w:pPr>
+      <w:r>
+        <w:rPr>
+          <w:bCs/>
+          <w:b/>
+        </w:rPr>
+        <w:t xml:space="preserve">Code:</w:t>
+      </w:r>
+    </w:p>
+    <w:p>
+      <w:pPr>
+        <w:pStyle w:val="SourceCode"/>
+      </w:pPr>
+      <w:r>
+        <w:rPr>
+          <w:rStyle w:val="VerbatimChar"/>
+        </w:rPr>
+        <w:t xml:space="preserve">useradd -m -s /bin/bash -g Engineering eng_user1</w:t>
+      </w:r>
+      <w:r>
+        <w:br/>
+      </w:r>
+      <w:r>
+        <w:rPr>
+          <w:rStyle w:val="VerbatimChar"/>
+        </w:rPr>
+        <w:t xml:space="preserve">useradd -m -s /bin/bash -g Engineering eng_user2</w:t>
+      </w:r>
+      <w:r>
+        <w:br/>
+      </w:r>
+      <w:r>
+        <w:rPr>
+          <w:rStyle w:val="VerbatimChar"/>
+        </w:rPr>
+        <w:t xml:space="preserve">useradd -m -s /bin/bash -g Sales sales_user1</w:t>
+      </w:r>
+      <w:r>
+        <w:br/>
+      </w:r>
+      <w:r>
+        <w:rPr>
+          <w:rStyle w:val="VerbatimChar"/>
+        </w:rPr>
+        <w:t xml:space="preserve">useradd -m -s /bin/bash -g Sales sales_user2</w:t>
+      </w:r>
+      <w:r>
+        <w:br/>
+      </w:r>
+      <w:r>
+        <w:rPr>
+          <w:rStyle w:val="VerbatimChar"/>
+        </w:rPr>
+        <w:t xml:space="preserve">useradd -m -s /bin/bash -g HR hr_user1</w:t>
+      </w:r>
+      <w:r>
+        <w:br/>
+      </w:r>
+      <w:r>
+        <w:rPr>
+          <w:rStyle w:val="VerbatimChar"/>
+        </w:rPr>
+        <w:t xml:space="preserve">useradd -m -s /bin/bash -g HR hr_user2</w:t>
+      </w:r>
+    </w:p>
+    <w:p>
+      <w:pPr>
+        <w:pStyle w:val="FirstParagraph"/>
+      </w:pPr>
+      <w:r>
+        <w:rPr>
+          <w:bCs/>
+          <w:b/>
+        </w:rPr>
+        <w:t xml:space="preserve">Verification:</w:t>
       </w:r>
       <w:r>
         <w:t xml:space="preserve"> </w:t>
@@ -1004,7 +1377,7 @@
         <w:t xml:space="preserve"> </w:t>
       </w:r>
       <w:r>
-        <w:t xml:space="preserve">and</w:t>
+        <w:t xml:space="preserve">shows the right primary group for every user, and</w:t>
       </w:r>
       <w:r>
         <w:t xml:space="preserve"> </w:t>
@@ -1019,7 +1392,22 @@
         <w:t xml:space="preserve"> </w:t>
       </w:r>
       <w:r>
-        <w:t xml:space="preserve">verifies this.</w:t>
+        <w:t xml:space="preserve">shows</w:t>
+      </w:r>
+      <w:r>
+        <w:t xml:space="preserve"> </w:t>
+      </w:r>
+      <w:r>
+        <w:rPr>
+          <w:rStyle w:val="VerbatimChar"/>
+        </w:rPr>
+        <w:t xml:space="preserve">/bin/bash</w:t>
+      </w:r>
+      <w:r>
+        <w:t xml:space="preserve"> </w:t>
+      </w:r>
+      <w:r>
+        <w:t xml:space="preserve">for all of them.</w:t>
       </w:r>
     </w:p>
     <w:p>
@@ -1079,13 +1467,13 @@
         <w:t xml:space="preserve">Task 5: Secure the department directories</w:t>
       </w:r>
     </w:p>
-    <w:bookmarkStart w:id="42" w:name="X841c416432f93a1ad726e705e88368d4466ca2d"/>
+    <w:bookmarkStart w:id="42" w:name="a-owner-and-group"/>
     <w:p>
       <w:pPr>
         <w:pStyle w:val="Heading3"/>
       </w:pPr>
       <w:r>
-        <w:t xml:space="preserve">5a – Owner is the department admin, group is the department group</w:t>
+        <w:t xml:space="preserve">5a – Owner and group</w:t>
       </w:r>
     </w:p>
     <w:p>
@@ -1094,6 +1482,16 @@
       </w:pPr>
       <w:r>
         <w:rPr>
+          <w:bCs/>
+          <w:b/>
+        </w:rPr>
+        <w:t xml:space="preserve">How we did it:</w:t>
+      </w:r>
+      <w:r>
+        <w:t xml:space="preserve"> </w:t>
+      </w:r>
+      <w:r>
+        <w:rPr>
           <w:rStyle w:val="VerbatimChar"/>
         </w:rPr>
         <w:t xml:space="preserve">chown user:group</w:t>
@@ -1102,7 +1500,60 @@
         <w:t xml:space="preserve"> </w:t>
       </w:r>
       <w:r>
-        <w:t xml:space="preserve">sets both the owner and the group owner in a single command.</w:t>
+        <w:t xml:space="preserve">sets the owner and the group of a folder in one command. The department admin becomes the owner, and the department group becomes the group owner.</w:t>
+      </w:r>
+    </w:p>
+    <w:p>
+      <w:pPr>
+        <w:pStyle w:val="BodyText"/>
+      </w:pPr>
+      <w:r>
+        <w:rPr>
+          <w:bCs/>
+          <w:b/>
+        </w:rPr>
+        <w:t xml:space="preserve">Code:</w:t>
+      </w:r>
+    </w:p>
+    <w:p>
+      <w:pPr>
+        <w:pStyle w:val="SourceCode"/>
+      </w:pPr>
+      <w:r>
+        <w:rPr>
+          <w:rStyle w:val="VerbatimChar"/>
+        </w:rPr>
+        <w:t xml:space="preserve">chown eng_admin:Engineering /Engineering</w:t>
+      </w:r>
+      <w:r>
+        <w:br/>
+      </w:r>
+      <w:r>
+        <w:rPr>
+          <w:rStyle w:val="VerbatimChar"/>
+        </w:rPr>
+        <w:t xml:space="preserve">chown sales_admin:Sales /Sales</w:t>
+      </w:r>
+      <w:r>
+        <w:br/>
+      </w:r>
+      <w:r>
+        <w:rPr>
+          <w:rStyle w:val="VerbatimChar"/>
+        </w:rPr>
+        <w:t xml:space="preserve">chown hr_admin:HR /HR</w:t>
+      </w:r>
+    </w:p>
+    <w:p>
+      <w:pPr>
+        <w:pStyle w:val="FirstParagraph"/>
+      </w:pPr>
+      <w:r>
+        <w:rPr>
+          <w:bCs/>
+          <w:b/>
+        </w:rPr>
+        <w:t xml:space="preserve">Verification:</w:t>
       </w:r>
       <w:r>
         <w:t xml:space="preserve"> </w:t>
@@ -1182,7 +1633,17 @@
         <w:pStyle w:val="FirstParagraph"/>
       </w:pPr>
       <w:r>
-        <w:t xml:space="preserve">All of the permission requirements are covered by one command,</w:t>
+        <w:rPr>
+          <w:bCs/>
+          <w:b/>
+        </w:rPr>
+        <w:t xml:space="preserve">How we did it:</w:t>
+      </w:r>
+      <w:r>
+        <w:t xml:space="preserve"> </w:t>
+      </w:r>
+      <w:r>
+        <w:t xml:space="preserve">One command covers all the permission rules:</w:t>
       </w:r>
       <w:r>
         <w:t xml:space="preserve"> </w:t>
@@ -1194,7 +1655,7 @@
         <w:t xml:space="preserve">chmod 1770</w:t>
       </w:r>
       <w:r>
-        <w:t xml:space="preserve">:</w:t>
+        <w:t xml:space="preserve">. Each digit means:</w:t>
       </w:r>
     </w:p>
     <w:tbl>
@@ -1245,7 +1706,7 @@
               <w:jc w:val="left"/>
             </w:pPr>
             <w:r>
-              <w:t xml:space="preserve">Requirement</w:t>
+              <w:t xml:space="preserve">Task</w:t>
             </w:r>
           </w:p>
         </w:tc>
@@ -1317,19 +1778,19 @@
               <w:jc w:val="left"/>
             </w:pPr>
             <w:r>
-              <w:t xml:space="preserve">Owner (department admin): read, write, execute (full access)</w:t>
-            </w:r>
-          </w:p>
-        </w:tc>
-        <w:tc>
-          <w:tcPr/>
-          <w:p>
-            <w:pPr>
-              <w:pStyle w:val="Compact"/>
-              <w:jc w:val="left"/>
-            </w:pPr>
-            <w:r>
-              <w:t xml:space="preserve">5b, 5c</w:t>
+              <w:t xml:space="preserve">Owner (admin): read, write and execute, which is full access</w:t>
+            </w:r>
+          </w:p>
+        </w:tc>
+        <w:tc>
+          <w:tcPr/>
+          <w:p>
+            <w:pPr>
+              <w:pStyle w:val="Compact"/>
+              <w:jc w:val="left"/>
+            </w:pPr>
+            <w:r>
+              <w:t xml:space="preserve">5b</w:t>
             </w:r>
           </w:p>
         </w:tc>
@@ -1359,7 +1820,7 @@
               <w:jc w:val="left"/>
             </w:pPr>
             <w:r>
-              <w:t xml:space="preserve">Group (department users): read, write, execute (full access)</w:t>
+              <w:t xml:space="preserve">Group (department users): read, write and execute, which is full access</w:t>
             </w:r>
           </w:p>
         </w:tc>
@@ -1424,7 +1885,34 @@
         <w:pStyle w:val="BodyText"/>
       </w:pPr>
       <w:r>
-        <w:t xml:space="preserve">In the</w:t>
+        <w:rPr>
+          <w:bCs/>
+          <w:b/>
+        </w:rPr>
+        <w:t xml:space="preserve">Code:</w:t>
+      </w:r>
+    </w:p>
+    <w:p>
+      <w:pPr>
+        <w:pStyle w:val="SourceCode"/>
+      </w:pPr>
+      <w:r>
+        <w:rPr>
+          <w:rStyle w:val="VerbatimChar"/>
+        </w:rPr>
+        <w:t xml:space="preserve">chmod 1770 /Engineering /Sales /HR</w:t>
+      </w:r>
+    </w:p>
+    <w:p>
+      <w:pPr>
+        <w:pStyle w:val="FirstParagraph"/>
+      </w:pPr>
+      <w:r>
+        <w:rPr>
+          <w:bCs/>
+          <w:b/>
+        </w:rPr>
+        <w:t xml:space="preserve">Verification:</w:t>
       </w:r>
       <w:r>
         <w:t xml:space="preserve"> </w:t>
@@ -1439,7 +1927,7 @@
         <w:t xml:space="preserve"> </w:t>
       </w:r>
       <w:r>
-        <w:t xml:space="preserve">output,</w:t>
+        <w:t xml:space="preserve">shows</w:t>
       </w:r>
       <w:r>
         <w:t xml:space="preserve"> </w:t>
@@ -1451,14 +1939,17 @@
         <w:t xml:space="preserve">drwxrwx--T</w:t>
       </w:r>
       <w:r>
-        <w:t xml:space="preserve"> </w:t>
-      </w:r>
-      <w:r>
-        <w:t xml:space="preserve">shows</w:t>
-      </w:r>
-      <w:r>
-        <w:t xml:space="preserve"> </w:t>
-      </w:r>
+        <w:t xml:space="preserve">:</w:t>
+      </w:r>
+    </w:p>
+    <w:p>
+      <w:pPr>
+        <w:numPr>
+          <w:ilvl w:val="0"/>
+          <w:numId w:val="1004"/>
+        </w:numPr>
+        <w:pStyle w:val="Compact"/>
+      </w:pPr>
       <w:r>
         <w:rPr>
           <w:rStyle w:val="VerbatimChar"/>
@@ -1469,11 +1960,38 @@
         <w:t xml:space="preserve"> </w:t>
       </w:r>
       <w:r>
-        <w:t xml:space="preserve">for owner and group and</w:t>
-      </w:r>
-      <w:r>
-        <w:t xml:space="preserve"> </w:t>
-      </w:r>
+        <w:t xml:space="preserve">for the owner,</w:t>
+      </w:r>
+    </w:p>
+    <w:p>
+      <w:pPr>
+        <w:numPr>
+          <w:ilvl w:val="0"/>
+          <w:numId w:val="1004"/>
+        </w:numPr>
+        <w:pStyle w:val="Compact"/>
+      </w:pPr>
+      <w:r>
+        <w:rPr>
+          <w:rStyle w:val="VerbatimChar"/>
+        </w:rPr>
+        <w:t xml:space="preserve">rwx</w:t>
+      </w:r>
+      <w:r>
+        <w:t xml:space="preserve"> </w:t>
+      </w:r>
+      <w:r>
+        <w:t xml:space="preserve">for the group,</w:t>
+      </w:r>
+    </w:p>
+    <w:p>
+      <w:pPr>
+        <w:numPr>
+          <w:ilvl w:val="0"/>
+          <w:numId w:val="1004"/>
+        </w:numPr>
+        <w:pStyle w:val="Compact"/>
+      </w:pPr>
       <w:r>
         <w:rPr>
           <w:rStyle w:val="VerbatimChar"/>
@@ -1484,11 +2002,17 @@
         <w:t xml:space="preserve"> </w:t>
       </w:r>
       <w:r>
-        <w:t xml:space="preserve">for others. The</w:t>
-      </w:r>
-      <w:r>
-        <w:t xml:space="preserve"> </w:t>
-      </w:r>
+        <w:t xml:space="preserve">for others,</w:t>
+      </w:r>
+    </w:p>
+    <w:p>
+      <w:pPr>
+        <w:numPr>
+          <w:ilvl w:val="0"/>
+          <w:numId w:val="1004"/>
+        </w:numPr>
+        <w:pStyle w:val="Compact"/>
+      </w:pPr>
       <w:r>
         <w:rPr>
           <w:rStyle w:val="VerbatimChar"/>
@@ -1499,12 +2023,12 @@
         <w:t xml:space="preserve"> </w:t>
       </w:r>
       <w:r>
-        <w:t xml:space="preserve">at the end is the sticky bit.</w:t>
-      </w:r>
-    </w:p>
-    <w:p>
-      <w:pPr>
-        <w:pStyle w:val="BodyText"/>
+        <w:t xml:space="preserve">at the end, which means the sticky bit is on.</w:t>
+      </w:r>
+    </w:p>
+    <w:p>
+      <w:pPr>
+        <w:pStyle w:val="FirstParagraph"/>
       </w:pPr>
       <w:r>
         <w:drawing>
@@ -1550,38 +2074,94 @@
       </w:r>
     </w:p>
     <w:bookmarkEnd w:id="46"/>
-    <w:bookmarkStart w:id="50" w:name="testing-the-directory-permissions"/>
+    <w:bookmarkStart w:id="50" w:name="test-of-task-5"/>
     <w:p>
       <w:pPr>
         <w:pStyle w:val="Heading3"/>
       </w:pPr>
       <w:r>
-        <w:t xml:space="preserve">Testing the directory permissions</w:t>
+        <w:t xml:space="preserve">Test of task 5</w:t>
+      </w:r>
+    </w:p>
+    <w:p>
+      <w:pPr>
+        <w:pStyle w:val="FirstParagraph"/>
+      </w:pPr>
+      <w:r>
+        <w:rPr>
+          <w:bCs/>
+          <w:b/>
+        </w:rPr>
+        <w:t xml:space="preserve">How we tested it:</w:t>
+      </w:r>
+      <w:r>
+        <w:t xml:space="preserve"> </w:t>
+      </w:r>
+      <w:r>
+        <w:t xml:space="preserve">We use</w:t>
+      </w:r>
+      <w:r>
+        <w:t xml:space="preserve"> </w:t>
+      </w:r>
+      <w:r>
+        <w:rPr>
+          <w:rStyle w:val="VerbatimChar"/>
+        </w:rPr>
+        <w:t xml:space="preserve">su - &lt;user&gt; -c '&lt;command&gt;'</w:t>
+      </w:r>
+      <w:r>
+        <w:t xml:space="preserve"> </w:t>
+      </w:r>
+      <w:r>
+        <w:t xml:space="preserve">to run a command as another user.</w:t>
       </w:r>
     </w:p>
     <w:p>
       <w:pPr>
         <w:numPr>
           <w:ilvl w:val="0"/>
-          <w:numId w:val="1002"/>
+          <w:numId w:val="1005"/>
         </w:numPr>
         <w:pStyle w:val="Compact"/>
       </w:pPr>
       <w:r>
-        <w:t xml:space="preserve">The admin (5b) and a regular user (5d) can both create files in the department directory.</w:t>
+        <w:rPr>
+          <w:bCs/>
+          <w:b/>
+        </w:rPr>
+        <w:t xml:space="preserve">eng_user1</w:t>
+      </w:r>
+      <w:r>
+        <w:t xml:space="preserve"> </w:t>
+      </w:r>
+      <w:r>
+        <w:t xml:space="preserve">creates a file in</w:t>
+      </w:r>
+      <w:r>
+        <w:t xml:space="preserve"> </w:t>
+      </w:r>
+      <w:r>
+        <w:rPr>
+          <w:rStyle w:val="VerbatimChar"/>
+        </w:rPr>
+        <w:t xml:space="preserve">/Engineering</w:t>
+      </w:r>
+      <w:r>
+        <w:t xml:space="preserve">. ✅ This works, so users have full access (5d).</w:t>
       </w:r>
     </w:p>
     <w:p>
       <w:pPr>
         <w:numPr>
           <w:ilvl w:val="0"/>
-          <w:numId w:val="1002"/>
+          <w:numId w:val="1005"/>
         </w:numPr>
         <w:pStyle w:val="Compact"/>
       </w:pPr>
       <w:r>
         <w:rPr>
-          <w:rStyle w:val="VerbatimChar"/>
+          <w:bCs/>
+          <w:b/>
         </w:rPr>
         <w:t xml:space="preserve">eng_user2</w:t>
       </w:r>
@@ -1589,67 +2169,96 @@
         <w:t xml:space="preserve"> </w:t>
       </w:r>
       <w:r>
-        <w:t xml:space="preserve">cannot change or delete the file owned by</w:t>
-      </w:r>
-      <w:r>
-        <w:t xml:space="preserve"> </w:t>
-      </w:r>
-      <w:r>
-        <w:rPr>
-          <w:rStyle w:val="VerbatimChar"/>
-        </w:rPr>
-        <w:t xml:space="preserve">eng_user1</w:t>
-      </w:r>
-      <w:r>
-        <w:t xml:space="preserve">, but</w:t>
-      </w:r>
-      <w:r>
-        <w:t xml:space="preserve"> </w:t>
-      </w:r>
-      <w:r>
-        <w:rPr>
-          <w:rStyle w:val="VerbatimChar"/>
-        </w:rPr>
-        <w:t xml:space="preserve">eng_user1</w:t>
-      </w:r>
-      <w:r>
-        <w:t xml:space="preserve"> </w:t>
-      </w:r>
-      <w:r>
-        <w:t xml:space="preserve">can delete their own file. This shows the sticky bit works (5c).</w:t>
+        <w:t xml:space="preserve">tries to delete eng_user1’s file. ❌</w:t>
+      </w:r>
+      <w:r>
+        <w:t xml:space="preserve"> </w:t>
+      </w:r>
+      <w:r>
+        <w:rPr>
+          <w:iCs/>
+          <w:i/>
+        </w:rPr>
+        <w:t xml:space="preserve">Operation not permitted</w:t>
+      </w:r>
+      <w:r>
+        <w:t xml:space="preserve">. The sticky bit works (5c).</w:t>
       </w:r>
     </w:p>
     <w:p>
       <w:pPr>
         <w:numPr>
           <w:ilvl w:val="0"/>
-          <w:numId w:val="1002"/>
+          <w:numId w:val="1005"/>
         </w:numPr>
         <w:pStyle w:val="Compact"/>
       </w:pPr>
       <w:r>
-        <w:t xml:space="preserve">Users from other departments (</w:t>
-      </w:r>
-      <w:r>
-        <w:rPr>
-          <w:rStyle w:val="VerbatimChar"/>
+        <w:rPr>
+          <w:bCs/>
+          <w:b/>
+        </w:rPr>
+        <w:t xml:space="preserve">eng_user1</w:t>
+      </w:r>
+      <w:r>
+        <w:t xml:space="preserve"> </w:t>
+      </w:r>
+      <w:r>
+        <w:t xml:space="preserve">deletes their own file. ✅ This works.</w:t>
+      </w:r>
+    </w:p>
+    <w:p>
+      <w:pPr>
+        <w:numPr>
+          <w:ilvl w:val="0"/>
+          <w:numId w:val="1005"/>
+        </w:numPr>
+        <w:pStyle w:val="Compact"/>
+      </w:pPr>
+      <w:r>
+        <w:rPr>
+          <w:bCs/>
+          <w:b/>
         </w:rPr>
         <w:t xml:space="preserve">sales_user1</w:t>
       </w:r>
       <w:r>
-        <w:t xml:space="preserve">,</w:t>
-      </w:r>
-      <w:r>
-        <w:t xml:space="preserve"> </w:t>
-      </w:r>
-      <w:r>
-        <w:rPr>
-          <w:rStyle w:val="VerbatimChar"/>
+        <w:t xml:space="preserve"> </w:t>
+      </w:r>
+      <w:r>
+        <w:t xml:space="preserve">and</w:t>
+      </w:r>
+      <w:r>
+        <w:t xml:space="preserve"> </w:t>
+      </w:r>
+      <w:r>
+        <w:rPr>
+          <w:bCs/>
+          <w:b/>
         </w:rPr>
         <w:t xml:space="preserve">hr_admin</w:t>
       </w:r>
       <w:r>
-        <w:t xml:space="preserve">) cannot list or write to a directory that is not theirs (5e).</w:t>
+        <w:t xml:space="preserve"> </w:t>
+      </w:r>
+      <w:r>
+        <w:t xml:space="preserve">try to use folders from other departments. ❌</w:t>
+      </w:r>
+      <w:r>
+        <w:t xml:space="preserve"> </w:t>
+      </w:r>
+      <w:r>
+        <w:rPr>
+          <w:iCs/>
+          <w:i/>
+        </w:rPr>
+        <w:t xml:space="preserve">Permission denied</w:t>
+      </w:r>
+      <w:r>
+        <w:t xml:space="preserve"> </w:t>
+      </w:r>
+      <w:r>
+        <w:t xml:space="preserve">(5e).</w:t>
       </w:r>
     </w:p>
     <w:p>
@@ -1715,7 +2324,32 @@
         <w:pStyle w:val="FirstParagraph"/>
       </w:pPr>
       <w:r>
-        <w:t xml:space="preserve">We create</w:t>
+        <w:rPr>
+          <w:bCs/>
+          <w:b/>
+        </w:rPr>
+        <w:t xml:space="preserve">How we did it:</w:t>
+      </w:r>
+    </w:p>
+    <w:p>
+      <w:pPr>
+        <w:numPr>
+          <w:ilvl w:val="0"/>
+          <w:numId w:val="1006"/>
+        </w:numPr>
+        <w:pStyle w:val="Compact"/>
+      </w:pPr>
+      <w:r>
+        <w:rPr>
+          <w:rStyle w:val="VerbatimChar"/>
+        </w:rPr>
+        <w:t xml:space="preserve">echo</w:t>
+      </w:r>
+      <w:r>
+        <w:t xml:space="preserve"> </w:t>
+      </w:r>
+      <w:r>
+        <w:t xml:space="preserve">writes the sentence into</w:t>
       </w:r>
       <w:r>
         <w:t xml:space="preserve"> </w:t>
@@ -1730,23 +2364,17 @@
         <w:t xml:space="preserve"> </w:t>
       </w:r>
       <w:r>
-        <w:t xml:space="preserve">in each directory with</w:t>
-      </w:r>
-      <w:r>
-        <w:t xml:space="preserve"> </w:t>
-      </w:r>
-      <w:r>
-        <w:rPr>
-          <w:rStyle w:val="VerbatimChar"/>
-        </w:rPr>
-        <w:t xml:space="preserve">echo</w:t>
-      </w:r>
-      <w:r>
-        <w:t xml:space="preserve">, containing exactly one line of text (6b).</w:t>
-      </w:r>
-      <w:r>
-        <w:t xml:space="preserve"> </w:t>
-      </w:r>
+        <w:t xml:space="preserve">in each folder. The file has exactly one line (6b).</w:t>
+      </w:r>
+    </w:p>
+    <w:p>
+      <w:pPr>
+        <w:numPr>
+          <w:ilvl w:val="0"/>
+          <w:numId w:val="1006"/>
+        </w:numPr>
+        <w:pStyle w:val="Compact"/>
+      </w:pPr>
       <w:r>
         <w:rPr>
           <w:rStyle w:val="VerbatimChar"/>
@@ -1757,11 +2385,17 @@
         <w:t xml:space="preserve"> </w:t>
       </w:r>
       <w:r>
-        <w:t xml:space="preserve">gives the file the same ownership as its directory (6a).</w:t>
-      </w:r>
-      <w:r>
-        <w:t xml:space="preserve"> </w:t>
-      </w:r>
+        <w:t xml:space="preserve">gives the file the same owner and group as its folder (6a).</w:t>
+      </w:r>
+    </w:p>
+    <w:p>
+      <w:pPr>
+        <w:numPr>
+          <w:ilvl w:val="0"/>
+          <w:numId w:val="1006"/>
+        </w:numPr>
+        <w:pStyle w:val="Compact"/>
+      </w:pPr>
       <w:r>
         <w:rPr>
           <w:rStyle w:val="VerbatimChar"/>
@@ -1772,7 +2406,7 @@
         <w:t xml:space="preserve"> </w:t>
       </w:r>
       <w:r>
-        <w:t xml:space="preserve">sets the access (6c):</w:t>
+        <w:t xml:space="preserve">sets who can do what (6c):</w:t>
       </w:r>
     </w:p>
     <w:tbl>
@@ -1853,19 +2487,19 @@
               <w:jc w:val="left"/>
             </w:pPr>
             <w:r>
-              <w:t xml:space="preserve">Owner (department admin)</w:t>
-            </w:r>
-          </w:p>
-        </w:tc>
-        <w:tc>
-          <w:tcPr/>
-          <w:p>
-            <w:pPr>
-              <w:pStyle w:val="Compact"/>
-              <w:jc w:val="left"/>
-            </w:pPr>
-            <w:r>
-              <w:t xml:space="preserve">read + write: only the admin can modify the file</w:t>
+              <w:t xml:space="preserve">Owner (admin)</w:t>
+            </w:r>
+          </w:p>
+        </w:tc>
+        <w:tc>
+          <w:tcPr/>
+          <w:p>
+            <w:pPr>
+              <w:pStyle w:val="Compact"/>
+              <w:jc w:val="left"/>
+            </w:pPr>
+            <w:r>
+              <w:t xml:space="preserve">Read and write: only the admin can change the file</w:t>
             </w:r>
           </w:p>
         </w:tc>
@@ -1895,19 +2529,19 @@
               <w:jc w:val="left"/>
             </w:pPr>
             <w:r>
-              <w:t xml:space="preserve">Group (department users)</w:t>
-            </w:r>
-          </w:p>
-        </w:tc>
-        <w:tc>
-          <w:tcPr/>
-          <w:p>
-            <w:pPr>
-              <w:pStyle w:val="Compact"/>
-              <w:jc w:val="left"/>
-            </w:pPr>
-            <w:r>
-              <w:t xml:space="preserve">read only</w:t>
+              <w:t xml:space="preserve">Group (department)</w:t>
+            </w:r>
+          </w:p>
+        </w:tc>
+        <w:tc>
+          <w:tcPr/>
+          <w:p>
+            <w:pPr>
+              <w:pStyle w:val="Compact"/>
+              <w:jc w:val="left"/>
+            </w:pPr>
+            <w:r>
+              <w:t xml:space="preserve">Read only</w:t>
             </w:r>
           </w:p>
         </w:tc>
@@ -1949,12 +2583,146 @@
               <w:jc w:val="left"/>
             </w:pPr>
             <w:r>
-              <w:t xml:space="preserve">no permissions</w:t>
+              <w:t xml:space="preserve">No permissions</w:t>
             </w:r>
           </w:p>
         </w:tc>
       </w:tr>
     </w:tbl>
+    <w:p>
+      <w:pPr>
+        <w:pStyle w:val="BodyText"/>
+      </w:pPr>
+      <w:r>
+        <w:rPr>
+          <w:bCs/>
+          <w:b/>
+        </w:rPr>
+        <w:t xml:space="preserve">Code:</w:t>
+      </w:r>
+    </w:p>
+    <w:p>
+      <w:pPr>
+        <w:pStyle w:val="SourceCode"/>
+      </w:pPr>
+      <w:r>
+        <w:rPr>
+          <w:rStyle w:val="VerbatimChar"/>
+        </w:rPr>
+        <w:t xml:space="preserve">for d in Engineering Sales HR; do</w:t>
+      </w:r>
+      <w:r>
+        <w:br/>
+      </w:r>
+      <w:r>
+        <w:rPr>
+          <w:rStyle w:val="VerbatimChar"/>
+        </w:rPr>
+        <w:t xml:space="preserve">  echo "This file contains confidential information for the department." &gt; /$d/confidential.txt</w:t>
+      </w:r>
+      <w:r>
+        <w:br/>
+      </w:r>
+      <w:r>
+        <w:rPr>
+          <w:rStyle w:val="VerbatimChar"/>
+        </w:rPr>
+        <w:t xml:space="preserve">done</w:t>
+      </w:r>
+      <w:r>
+        <w:br/>
+      </w:r>
+      <w:r>
+        <w:rPr>
+          <w:rStyle w:val="VerbatimChar"/>
+        </w:rPr>
+        <w:t xml:space="preserve">chown eng_admin:Engineering /Engineering/confidential.txt</w:t>
+      </w:r>
+      <w:r>
+        <w:br/>
+      </w:r>
+      <w:r>
+        <w:rPr>
+          <w:rStyle w:val="VerbatimChar"/>
+        </w:rPr>
+        <w:t xml:space="preserve">chown sales_admin:Sales /Sales/confidential.txt</w:t>
+      </w:r>
+      <w:r>
+        <w:br/>
+      </w:r>
+      <w:r>
+        <w:rPr>
+          <w:rStyle w:val="VerbatimChar"/>
+        </w:rPr>
+        <w:t xml:space="preserve">chown hr_admin:HR /HR/confidential.txt</w:t>
+      </w:r>
+      <w:r>
+        <w:br/>
+      </w:r>
+      <w:r>
+        <w:rPr>
+          <w:rStyle w:val="VerbatimChar"/>
+        </w:rPr>
+        <w:t xml:space="preserve">chmod 640 /Engineering/confidential.txt /Sales/confidential.txt /HR/confidential.txt</w:t>
+      </w:r>
+    </w:p>
+    <w:p>
+      <w:pPr>
+        <w:pStyle w:val="FirstParagraph"/>
+      </w:pPr>
+      <w:r>
+        <w:rPr>
+          <w:bCs/>
+          <w:b/>
+        </w:rPr>
+        <w:t xml:space="preserve">Verification:</w:t>
+      </w:r>
+      <w:r>
+        <w:t xml:space="preserve"> </w:t>
+      </w:r>
+      <w:r>
+        <w:rPr>
+          <w:rStyle w:val="VerbatimChar"/>
+        </w:rPr>
+        <w:t xml:space="preserve">ls -l</w:t>
+      </w:r>
+      <w:r>
+        <w:t xml:space="preserve"> </w:t>
+      </w:r>
+      <w:r>
+        <w:t xml:space="preserve">shows</w:t>
+      </w:r>
+      <w:r>
+        <w:t xml:space="preserve"> </w:t>
+      </w:r>
+      <w:r>
+        <w:rPr>
+          <w:rStyle w:val="VerbatimChar"/>
+        </w:rPr>
+        <w:t xml:space="preserve">-rw-r-----</w:t>
+      </w:r>
+      <w:r>
+        <w:t xml:space="preserve"> </w:t>
+      </w:r>
+      <w:r>
+        <w:t xml:space="preserve">and the right owner for every file, and</w:t>
+      </w:r>
+      <w:r>
+        <w:t xml:space="preserve"> </w:t>
+      </w:r>
+      <w:r>
+        <w:rPr>
+          <w:rStyle w:val="VerbatimChar"/>
+        </w:rPr>
+        <w:t xml:space="preserve">cat</w:t>
+      </w:r>
+      <w:r>
+        <w:t xml:space="preserve"> </w:t>
+      </w:r>
+      <w:r>
+        <w:t xml:space="preserve">shows the one line of text.</w:t>
+      </w:r>
+    </w:p>
     <w:p>
       <w:pPr>
         <w:pStyle w:val="BodyText"/>
@@ -2002,25 +2770,69 @@
         </w:drawing>
       </w:r>
     </w:p>
-    <w:bookmarkStart w:id="58" w:name="testing-the-file-permissions"/>
+    <w:bookmarkStart w:id="58" w:name="test-of-task-6"/>
     <w:p>
       <w:pPr>
         <w:pStyle w:val="Heading3"/>
       </w:pPr>
       <w:r>
-        <w:t xml:space="preserve">Testing the file permissions</w:t>
+        <w:t xml:space="preserve">Test of task 6</w:t>
       </w:r>
     </w:p>
     <w:p>
       <w:pPr>
         <w:numPr>
           <w:ilvl w:val="0"/>
-          <w:numId w:val="1003"/>
+          <w:numId w:val="1007"/>
         </w:numPr>
         <w:pStyle w:val="Compact"/>
       </w:pPr>
       <w:r>
-        <w:t xml:space="preserve">A department user can read the file but gets</w:t>
+        <w:t xml:space="preserve">A department user</w:t>
+      </w:r>
+      <w:r>
+        <w:t xml:space="preserve"> </w:t>
+      </w:r>
+      <w:r>
+        <w:rPr>
+          <w:bCs/>
+          <w:b/>
+        </w:rPr>
+        <w:t xml:space="preserve">can read</w:t>
+      </w:r>
+      <w:r>
+        <w:t xml:space="preserve"> </w:t>
+      </w:r>
+      <w:r>
+        <w:t xml:space="preserve">the file. ✅</w:t>
+      </w:r>
+    </w:p>
+    <w:p>
+      <w:pPr>
+        <w:numPr>
+          <w:ilvl w:val="0"/>
+          <w:numId w:val="1007"/>
+        </w:numPr>
+        <w:pStyle w:val="Compact"/>
+      </w:pPr>
+      <w:r>
+        <w:t xml:space="preserve">A department user</w:t>
+      </w:r>
+      <w:r>
+        <w:t xml:space="preserve"> </w:t>
+      </w:r>
+      <w:r>
+        <w:rPr>
+          <w:bCs/>
+          <w:b/>
+        </w:rPr>
+        <w:t xml:space="preserve">cannot change</w:t>
+      </w:r>
+      <w:r>
+        <w:t xml:space="preserve"> </w:t>
+      </w:r>
+      <w:r>
+        <w:t xml:space="preserve">it. ❌</w:t>
       </w:r>
       <w:r>
         <w:t xml:space="preserve"> </w:t>
@@ -2032,35 +2844,71 @@
         </w:rPr>
         <w:t xml:space="preserve">Permission denied</w:t>
       </w:r>
-      <w:r>
-        <w:t xml:space="preserve"> </w:t>
-      </w:r>
-      <w:r>
-        <w:t xml:space="preserve">when trying to modify it.</w:t>
-      </w:r>
     </w:p>
     <w:p>
       <w:pPr>
         <w:numPr>
           <w:ilvl w:val="0"/>
-          <w:numId w:val="1003"/>
+          <w:numId w:val="1007"/>
         </w:numPr>
         <w:pStyle w:val="Compact"/>
       </w:pPr>
       <w:r>
-        <w:t xml:space="preserve">The department admin can modify it.</w:t>
+        <w:t xml:space="preserve">The admin</w:t>
+      </w:r>
+      <w:r>
+        <w:t xml:space="preserve"> </w:t>
+      </w:r>
+      <w:r>
+        <w:rPr>
+          <w:bCs/>
+          <w:b/>
+        </w:rPr>
+        <w:t xml:space="preserve">can change</w:t>
+      </w:r>
+      <w:r>
+        <w:t xml:space="preserve"> </w:t>
+      </w:r>
+      <w:r>
+        <w:t xml:space="preserve">it. ✅</w:t>
       </w:r>
     </w:p>
     <w:p>
       <w:pPr>
         <w:numPr>
           <w:ilvl w:val="0"/>
-          <w:numId w:val="1003"/>
+          <w:numId w:val="1007"/>
         </w:numPr>
         <w:pStyle w:val="Compact"/>
       </w:pPr>
       <w:r>
-        <w:t xml:space="preserve">Users from other departments cannot read it.</w:t>
+        <w:t xml:space="preserve">Users from other departments</w:t>
+      </w:r>
+      <w:r>
+        <w:t xml:space="preserve"> </w:t>
+      </w:r>
+      <w:r>
+        <w:rPr>
+          <w:bCs/>
+          <w:b/>
+        </w:rPr>
+        <w:t xml:space="preserve">cannot read</w:t>
+      </w:r>
+      <w:r>
+        <w:t xml:space="preserve"> </w:t>
+      </w:r>
+      <w:r>
+        <w:t xml:space="preserve">it. ❌</w:t>
+      </w:r>
+      <w:r>
+        <w:t xml:space="preserve"> </w:t>
+      </w:r>
+      <w:r>
+        <w:rPr>
+          <w:iCs/>
+          <w:i/>
+        </w:rPr>
+        <w:t xml:space="preserve">Permission denied</w:t>
       </w:r>
     </w:p>
     <w:p>
@@ -2119,7 +2967,7 @@
         <w:pStyle w:val="Heading1"/>
       </w:pPr>
       <w:r>
-        <w:t xml:space="preserve">Part 2 – User Management Script</w:t>
+        <w:t xml:space="preserve">Part 2 – User management script</w:t>
       </w:r>
     </w:p>
     <w:bookmarkStart w:id="61" w:name="how-the-script-works"/>
@@ -2136,7 +2984,7 @@
         <w:pStyle w:val="FirstParagraph"/>
       </w:pPr>
       <w:r>
-        <w:t xml:space="preserve">The script</w:t>
+        <w:t xml:space="preserve">Our script is called</w:t>
       </w:r>
       <w:r>
         <w:t xml:space="preserve"> </w:t>
@@ -2148,231 +2996,98 @@
         <w:t xml:space="preserve">usermgmt.sh</w:t>
       </w:r>
       <w:r>
-        <w:t xml:space="preserve"> </w:t>
-      </w:r>
-      <w:r>
-        <w:t xml:space="preserve">is interactive and contains</w:t>
-      </w:r>
-      <w:r>
-        <w:t xml:space="preserve"> </w:t>
-      </w:r>
-      <w:r>
-        <w:rPr>
-          <w:bCs/>
-          <w:b/>
-        </w:rPr>
-        <w:t xml:space="preserve">no hardcoded usernames or group names</w:t>
-      </w:r>
-      <w:r>
-        <w:t xml:space="preserve">. The administrator types in the group name, username and password while it runs. The steps are in a logical order: the group must exist before the user (it becomes the user’s primary group), and the user and group must exist before the directory can be given to them.</w:t>
-      </w:r>
-    </w:p>
-    <w:p>
-      <w:pPr>
-        <w:pStyle w:val="BodyText"/>
-      </w:pPr>
-      <w:r>
-        <w:t xml:space="preserve">The special variable</w:t>
-      </w:r>
-      <w:r>
-        <w:t xml:space="preserve"> </w:t>
-      </w:r>
-      <w:r>
-        <w:rPr>
-          <w:rStyle w:val="VerbatimChar"/>
-          <w:bCs/>
-          <w:b/>
-        </w:rPr>
-        <w:t xml:space="preserve">$?</w:t>
-      </w:r>
-      <w:r>
-        <w:t xml:space="preserve"> </w:t>
-      </w:r>
-      <w:r>
-        <w:t xml:space="preserve">holds the exit code of the previous command:</w:t>
-      </w:r>
-      <w:r>
-        <w:t xml:space="preserve"> </w:t>
-      </w:r>
-      <w:r>
-        <w:rPr>
-          <w:rStyle w:val="VerbatimChar"/>
-        </w:rPr>
-        <w:t xml:space="preserve">0</w:t>
-      </w:r>
-      <w:r>
-        <w:t xml:space="preserve"> </w:t>
-      </w:r>
-      <w:r>
-        <w:t xml:space="preserve">means success and anything else means failure. The script uses it after each important command to decide what to do next.</w:t>
+        <w:t xml:space="preserve">. It asks the administrator for a group name, a username and a password, so</w:t>
+      </w:r>
+      <w:r>
+        <w:t xml:space="preserve"> </w:t>
+      </w:r>
+      <w:r>
+        <w:rPr>
+          <w:bCs/>
+          <w:b/>
+        </w:rPr>
+        <w:t xml:space="preserve">no names are hardcoded</w:t>
+      </w:r>
+      <w:r>
+        <w:t xml:space="preserve">. It follows a logical order:</w:t>
       </w:r>
     </w:p>
     <w:p>
       <w:pPr>
         <w:numPr>
           <w:ilvl w:val="0"/>
-          <w:numId w:val="1004"/>
+          <w:numId w:val="1008"/>
         </w:numPr>
         <w:pStyle w:val="Compact"/>
       </w:pPr>
       <w:r>
-        <w:rPr>
-          <w:bCs/>
-          <w:b/>
-        </w:rPr>
-        <w:t xml:space="preserve">Root check.</w:t>
-      </w:r>
-      <w:r>
-        <w:t xml:space="preserve"> </w:t>
-      </w:r>
-      <w:r>
-        <w:t xml:space="preserve">The script exits with an error if it is not run as root, since every step below needs root privileges.</w:t>
+        <w:t xml:space="preserve">The group must exist before the user, because it becomes the user’s primary group.</w:t>
       </w:r>
     </w:p>
     <w:p>
       <w:pPr>
         <w:numPr>
           <w:ilvl w:val="0"/>
-          <w:numId w:val="1004"/>
+          <w:numId w:val="1008"/>
         </w:numPr>
         <w:pStyle w:val="Compact"/>
       </w:pPr>
       <w:r>
-        <w:rPr>
-          <w:bCs/>
-          <w:b/>
-        </w:rPr>
-        <w:t xml:space="preserve">(a) Create a new group.</w:t>
-      </w:r>
-      <w:r>
-        <w:t xml:space="preserve"> </w:t>
-      </w:r>
-      <w:r>
-        <w:t xml:space="preserve">A</w:t>
-      </w:r>
-      <w:r>
-        <w:t xml:space="preserve"> </w:t>
-      </w:r>
-      <w:r>
-        <w:rPr>
-          <w:rStyle w:val="VerbatimChar"/>
-        </w:rPr>
-        <w:t xml:space="preserve">while true</w:t>
-      </w:r>
-      <w:r>
-        <w:t xml:space="preserve"> </w:t>
-      </w:r>
-      <w:r>
-        <w:t xml:space="preserve">loop asks for a group name with</w:t>
-      </w:r>
-      <w:r>
-        <w:t xml:space="preserve"> </w:t>
-      </w:r>
-      <w:r>
-        <w:rPr>
-          <w:rStyle w:val="VerbatimChar"/>
-        </w:rPr>
-        <w:t xml:space="preserve">read -p</w:t>
-      </w:r>
-      <w:r>
-        <w:t xml:space="preserve">. An empty name is rejected.</w:t>
-      </w:r>
-      <w:r>
-        <w:t xml:space="preserve"> </w:t>
-      </w:r>
-      <w:r>
-        <w:rPr>
-          <w:rStyle w:val="VerbatimChar"/>
-        </w:rPr>
-        <w:t xml:space="preserve">getent group &lt;name&gt;</w:t>
-      </w:r>
-      <w:r>
-        <w:t xml:space="preserve"> </w:t>
-      </w:r>
-      <w:r>
-        <w:t xml:space="preserve">looks the name up. If</w:t>
-      </w:r>
-      <w:r>
-        <w:t xml:space="preserve"> </w:t>
-      </w:r>
-      <w:r>
-        <w:rPr>
-          <w:rStyle w:val="VerbatimChar"/>
+        <w:t xml:space="preserve">The user must exist before we can give them a folder.</w:t>
+      </w:r>
+    </w:p>
+    <w:p>
+      <w:pPr>
+        <w:pStyle w:val="FirstParagraph"/>
+      </w:pPr>
+      <w:r>
+        <w:t xml:space="preserve">The script uses the special variable</w:t>
+      </w:r>
+      <w:r>
+        <w:t xml:space="preserve"> </w:t>
+      </w:r>
+      <w:r>
+        <w:rPr>
+          <w:rStyle w:val="VerbatimChar"/>
+          <w:bCs/>
+          <w:b/>
         </w:rPr>
         <w:t xml:space="preserve">$?</w:t>
       </w:r>
       <w:r>
-        <w:t xml:space="preserve"> </w:t>
-      </w:r>
-      <w:r>
-        <w:t xml:space="preserve">is</w:t>
-      </w:r>
-      <w:r>
-        <w:t xml:space="preserve"> </w:t>
-      </w:r>
-      <w:r>
-        <w:rPr>
-          <w:rStyle w:val="VerbatimChar"/>
-        </w:rPr>
-        <w:t xml:space="preserve">0</w:t>
-      </w:r>
-      <w:r>
-        <w:t xml:space="preserve"> </w:t>
-      </w:r>
-      <w:r>
-        <w:t xml:space="preserve">the group already exists, so an error is printed and the loop asks for another name. Otherwise</w:t>
-      </w:r>
-      <w:r>
-        <w:t xml:space="preserve"> </w:t>
-      </w:r>
-      <w:r>
-        <w:rPr>
-          <w:rStyle w:val="VerbatimChar"/>
-        </w:rPr>
-        <w:t xml:space="preserve">groupadd</w:t>
-      </w:r>
-      <w:r>
-        <w:t xml:space="preserve"> </w:t>
-      </w:r>
-      <w:r>
-        <w:t xml:space="preserve">creates the group,</w:t>
-      </w:r>
-      <w:r>
-        <w:t xml:space="preserve"> </w:t>
-      </w:r>
-      <w:r>
-        <w:rPr>
-          <w:rStyle w:val="VerbatimChar"/>
-        </w:rPr>
-        <w:t xml:space="preserve">$?</w:t>
-      </w:r>
-      <w:r>
-        <w:t xml:space="preserve"> </w:t>
-      </w:r>
-      <w:r>
-        <w:t xml:space="preserve">confirms it worked, and</w:t>
-      </w:r>
-      <w:r>
-        <w:t xml:space="preserve"> </w:t>
-      </w:r>
-      <w:r>
-        <w:rPr>
-          <w:rStyle w:val="VerbatimChar"/>
-        </w:rPr>
-        <w:t xml:space="preserve">break</w:t>
-      </w:r>
-      <w:r>
-        <w:t xml:space="preserve"> </w:t>
-      </w:r>
-      <w:r>
-        <w:t xml:space="preserve">leaves the loop.</w:t>
+        <w:t xml:space="preserve">. It holds the result (exit code) of the last command:</w:t>
+      </w:r>
+      <w:r>
+        <w:t xml:space="preserve"> </w:t>
+      </w:r>
+      <w:r>
+        <w:rPr>
+          <w:bCs/>
+          <w:b/>
+        </w:rPr>
+        <w:t xml:space="preserve">0 means success</w:t>
+      </w:r>
+      <w:r>
+        <w:t xml:space="preserve">, and any other number means it failed. We use it to check whether a name already exists and whether each command worked.</w:t>
+      </w:r>
+    </w:p>
+    <w:p>
+      <w:pPr>
+        <w:pStyle w:val="BodyText"/>
+      </w:pPr>
+      <w:r>
+        <w:rPr>
+          <w:bCs/>
+          <w:b/>
+        </w:rPr>
+        <w:t xml:space="preserve">Step by step:</w:t>
       </w:r>
     </w:p>
     <w:p>
       <w:pPr>
         <w:numPr>
           <w:ilvl w:val="0"/>
-          <w:numId w:val="1004"/>
+          <w:numId w:val="1009"/>
         </w:numPr>
         <w:pStyle w:val="Compact"/>
       </w:pPr>
@@ -2381,47 +3096,20 @@
           <w:bCs/>
           <w:b/>
         </w:rPr>
-        <w:t xml:space="preserve">(b) Create a new user.</w:t>
-      </w:r>
-      <w:r>
-        <w:t xml:space="preserve"> </w:t>
-      </w:r>
-      <w:r>
-        <w:t xml:space="preserve">The same loop pattern with</w:t>
-      </w:r>
-      <w:r>
-        <w:t xml:space="preserve"> </w:t>
-      </w:r>
-      <w:r>
-        <w:rPr>
-          <w:rStyle w:val="VerbatimChar"/>
-        </w:rPr>
-        <w:t xml:space="preserve">getent passwd &lt;name&gt;</w:t>
-      </w:r>
-      <w:r>
-        <w:t xml:space="preserve"> </w:t>
-      </w:r>
-      <w:r>
-        <w:t xml:space="preserve">rejects existing usernames. A unique user is created with</w:t>
-      </w:r>
-      <w:r>
-        <w:t xml:space="preserve"> </w:t>
-      </w:r>
-      <w:r>
-        <w:rPr>
-          <w:rStyle w:val="VerbatimChar"/>
-        </w:rPr>
-        <w:t xml:space="preserve">useradd -m -s /bin/bash -g &lt;group&gt; &lt;user&gt;</w:t>
-      </w:r>
-      <w:r>
-        <w:t xml:space="preserve">, which gives a Bash login shell and makes the new group the primary group.</w:t>
+        <w:t xml:space="preserve">Start:</w:t>
+      </w:r>
+      <w:r>
+        <w:t xml:space="preserve"> </w:t>
+      </w:r>
+      <w:r>
+        <w:t xml:space="preserve">The script checks that it is run as root. If not, it stops with an error.</w:t>
       </w:r>
     </w:p>
     <w:p>
       <w:pPr>
         <w:numPr>
           <w:ilvl w:val="0"/>
-          <w:numId w:val="1004"/>
+          <w:numId w:val="1009"/>
         </w:numPr>
         <w:pStyle w:val="Compact"/>
       </w:pPr>
@@ -2430,56 +3118,65 @@
           <w:bCs/>
           <w:b/>
         </w:rPr>
-        <w:t xml:space="preserve">(c) Create a password.</w:t>
-      </w:r>
-      <w:r>
-        <w:t xml:space="preserve"> </w:t>
-      </w:r>
-      <w:r>
-        <w:t xml:space="preserve">The password is read twice with</w:t>
-      </w:r>
-      <w:r>
-        <w:t xml:space="preserve"> </w:t>
-      </w:r>
-      <w:r>
-        <w:rPr>
-          <w:rStyle w:val="VerbatimChar"/>
-        </w:rPr>
-        <w:t xml:space="preserve">read -s</w:t>
-      </w:r>
-      <w:r>
-        <w:t xml:space="preserve">, so it is hidden while typing. An empty or mismatching password is rejected and the admin tries again. The password is set with</w:t>
-      </w:r>
-      <w:r>
-        <w:t xml:space="preserve"> </w:t>
-      </w:r>
-      <w:r>
-        <w:rPr>
-          <w:rStyle w:val="VerbatimChar"/>
-        </w:rPr>
-        <w:t xml:space="preserve">chpasswd</w:t>
-      </w:r>
-      <w:r>
-        <w:t xml:space="preserve">, which stores it as a hash in</w:t>
-      </w:r>
-      <w:r>
-        <w:t xml:space="preserve"> </w:t>
-      </w:r>
-      <w:r>
-        <w:rPr>
-          <w:rStyle w:val="VerbatimChar"/>
-        </w:rPr>
-        <w:t xml:space="preserve">/etc/shadow</w:t>
-      </w:r>
-      <w:r>
-        <w:t xml:space="preserve">.</w:t>
+        <w:t xml:space="preserve">(a) Create a new group:</w:t>
+      </w:r>
+      <w:r>
+        <w:t xml:space="preserve"> </w:t>
+      </w:r>
+      <w:r>
+        <w:t xml:space="preserve">The script asks for a group name.</w:t>
+      </w:r>
+      <w:r>
+        <w:t xml:space="preserve"> </w:t>
+      </w:r>
+      <w:r>
+        <w:rPr>
+          <w:rStyle w:val="VerbatimChar"/>
+        </w:rPr>
+        <w:t xml:space="preserve">getent group &lt;name&gt;</w:t>
+      </w:r>
+      <w:r>
+        <w:t xml:space="preserve"> </w:t>
+      </w:r>
+      <w:r>
+        <w:t xml:space="preserve">checks whether the group already exists. If</w:t>
+      </w:r>
+      <w:r>
+        <w:t xml:space="preserve"> </w:t>
+      </w:r>
+      <w:r>
+        <w:rPr>
+          <w:rStyle w:val="VerbatimChar"/>
+        </w:rPr>
+        <w:t xml:space="preserve">$?</w:t>
+      </w:r>
+      <w:r>
+        <w:t xml:space="preserve"> </w:t>
+      </w:r>
+      <w:r>
+        <w:t xml:space="preserve">is 0, the group exists, so the script shows an error and asks for another name. If the name is free,</w:t>
+      </w:r>
+      <w:r>
+        <w:t xml:space="preserve"> </w:t>
+      </w:r>
+      <w:r>
+        <w:rPr>
+          <w:rStyle w:val="VerbatimChar"/>
+        </w:rPr>
+        <w:t xml:space="preserve">groupadd</w:t>
+      </w:r>
+      <w:r>
+        <w:t xml:space="preserve"> </w:t>
+      </w:r>
+      <w:r>
+        <w:t xml:space="preserve">creates the group.</w:t>
       </w:r>
     </w:p>
     <w:p>
       <w:pPr>
         <w:numPr>
           <w:ilvl w:val="0"/>
-          <w:numId w:val="1004"/>
+          <w:numId w:val="1009"/>
         </w:numPr>
         <w:pStyle w:val="Compact"/>
       </w:pPr>
@@ -2488,44 +3185,47 @@
           <w:bCs/>
           <w:b/>
         </w:rPr>
-        <w:t xml:space="preserve">(d) Group membership.</w:t>
-      </w:r>
-      <w:r>
-        <w:t xml:space="preserve"> </w:t>
-      </w:r>
-      <w:r>
-        <w:rPr>
-          <w:rStyle w:val="VerbatimChar"/>
-        </w:rPr>
-        <w:t xml:space="preserve">usermod -aG &lt;group&gt; &lt;user&gt;</w:t>
-      </w:r>
-      <w:r>
-        <w:t xml:space="preserve"> </w:t>
-      </w:r>
-      <w:r>
-        <w:t xml:space="preserve">adds the user as a member of the group, so they are listed in</w:t>
-      </w:r>
-      <w:r>
-        <w:t xml:space="preserve"> </w:t>
-      </w:r>
-      <w:r>
-        <w:rPr>
-          <w:rStyle w:val="VerbatimChar"/>
-        </w:rPr>
-        <w:t xml:space="preserve">/etc/group</w:t>
-      </w:r>
-      <w:r>
-        <w:t xml:space="preserve"> </w:t>
-      </w:r>
-      <w:r>
-        <w:t xml:space="preserve">as well as having it as their primary group.</w:t>
+        <w:t xml:space="preserve">(b) Create a new user:</w:t>
+      </w:r>
+      <w:r>
+        <w:t xml:space="preserve"> </w:t>
+      </w:r>
+      <w:r>
+        <w:t xml:space="preserve">The same idea with</w:t>
+      </w:r>
+      <w:r>
+        <w:t xml:space="preserve"> </w:t>
+      </w:r>
+      <w:r>
+        <w:rPr>
+          <w:rStyle w:val="VerbatimChar"/>
+        </w:rPr>
+        <w:t xml:space="preserve">getent passwd &lt;name&gt;</w:t>
+      </w:r>
+      <w:r>
+        <w:t xml:space="preserve">. If the name is free,</w:t>
+      </w:r>
+      <w:r>
+        <w:t xml:space="preserve"> </w:t>
+      </w:r>
+      <w:r>
+        <w:rPr>
+          <w:rStyle w:val="VerbatimChar"/>
+        </w:rPr>
+        <w:t xml:space="preserve">useradd -m -s /bin/bash -g &lt;group&gt; &lt;user&gt;</w:t>
+      </w:r>
+      <w:r>
+        <w:t xml:space="preserve"> </w:t>
+      </w:r>
+      <w:r>
+        <w:t xml:space="preserve">creates the user with a Bash login shell and the new group as primary group.</w:t>
       </w:r>
     </w:p>
     <w:p>
       <w:pPr>
         <w:numPr>
           <w:ilvl w:val="0"/>
-          <w:numId w:val="1004"/>
+          <w:numId w:val="1009"/>
         </w:numPr>
         <w:pStyle w:val="Compact"/>
       </w:pPr>
@@ -2534,29 +3234,47 @@
           <w:bCs/>
           <w:b/>
         </w:rPr>
-        <w:t xml:space="preserve">(e) Directory.</w:t>
-      </w:r>
-      <w:r>
-        <w:t xml:space="preserve"> </w:t>
-      </w:r>
-      <w:r>
-        <w:rPr>
-          <w:rStyle w:val="VerbatimChar"/>
-        </w:rPr>
-        <w:t xml:space="preserve">mkdir /&lt;username&gt;</w:t>
-      </w:r>
-      <w:r>
-        <w:t xml:space="preserve"> </w:t>
-      </w:r>
-      <w:r>
-        <w:t xml:space="preserve">creates a directory at the root with the same name as the user. If this fails, the script stops with an error.</w:t>
+        <w:t xml:space="preserve">(c) Create a password:</w:t>
+      </w:r>
+      <w:r>
+        <w:t xml:space="preserve"> </w:t>
+      </w:r>
+      <w:r>
+        <w:t xml:space="preserve">The password is typed twice with</w:t>
+      </w:r>
+      <w:r>
+        <w:t xml:space="preserve"> </w:t>
+      </w:r>
+      <w:r>
+        <w:rPr>
+          <w:rStyle w:val="VerbatimChar"/>
+        </w:rPr>
+        <w:t xml:space="preserve">read -s</w:t>
+      </w:r>
+      <w:r>
+        <w:t xml:space="preserve">, so it is hidden. If the two passwords are different or empty, the script asks again.</w:t>
+      </w:r>
+      <w:r>
+        <w:t xml:space="preserve"> </w:t>
+      </w:r>
+      <w:r>
+        <w:rPr>
+          <w:rStyle w:val="VerbatimChar"/>
+        </w:rPr>
+        <w:t xml:space="preserve">chpasswd</w:t>
+      </w:r>
+      <w:r>
+        <w:t xml:space="preserve"> </w:t>
+      </w:r>
+      <w:r>
+        <w:t xml:space="preserve">saves the password.</w:t>
       </w:r>
     </w:p>
     <w:p>
       <w:pPr>
         <w:numPr>
           <w:ilvl w:val="0"/>
-          <w:numId w:val="1004"/>
+          <w:numId w:val="1009"/>
         </w:numPr>
         <w:pStyle w:val="Compact"/>
       </w:pPr>
@@ -2565,26 +3283,29 @@
           <w:bCs/>
           <w:b/>
         </w:rPr>
-        <w:t xml:space="preserve">(f) Ownership.</w:t>
-      </w:r>
-      <w:r>
-        <w:t xml:space="preserve"> </w:t>
-      </w:r>
-      <w:r>
-        <w:rPr>
-          <w:rStyle w:val="VerbatimChar"/>
-        </w:rPr>
-        <w:t xml:space="preserve">chown &lt;user&gt;:&lt;group&gt; /&lt;username&gt;</w:t>
-      </w:r>
-      <w:r>
-        <w:t xml:space="preserve">.</w:t>
+        <w:t xml:space="preserve">(d) Group membership:</w:t>
+      </w:r>
+      <w:r>
+        <w:t xml:space="preserve"> </w:t>
+      </w:r>
+      <w:r>
+        <w:rPr>
+          <w:rStyle w:val="VerbatimChar"/>
+        </w:rPr>
+        <w:t xml:space="preserve">usermod -aG &lt;group&gt; &lt;user&gt;</w:t>
+      </w:r>
+      <w:r>
+        <w:t xml:space="preserve"> </w:t>
+      </w:r>
+      <w:r>
+        <w:t xml:space="preserve">adds the user as a member of the new group.</w:t>
       </w:r>
     </w:p>
     <w:p>
       <w:pPr>
         <w:numPr>
           <w:ilvl w:val="0"/>
-          <w:numId w:val="1004"/>
+          <w:numId w:val="1009"/>
         </w:numPr>
         <w:pStyle w:val="Compact"/>
       </w:pPr>
@@ -2593,71 +3314,29 @@
           <w:bCs/>
           <w:b/>
         </w:rPr>
-        <w:t xml:space="preserve">(g + h) Permissions.</w:t>
-      </w:r>
-      <w:r>
-        <w:t xml:space="preserve"> </w:t>
-      </w:r>
-      <w:r>
-        <w:rPr>
-          <w:rStyle w:val="VerbatimChar"/>
-        </w:rPr>
-        <w:t xml:space="preserve">chmod 1770</w:t>
-      </w:r>
-      <w:r>
-        <w:t xml:space="preserve"> </w:t>
-      </w:r>
-      <w:r>
-        <w:t xml:space="preserve">gives full control to the owner (</w:t>
-      </w:r>
-      <w:r>
-        <w:rPr>
-          <w:rStyle w:val="VerbatimChar"/>
-        </w:rPr>
-        <w:t xml:space="preserve">7</w:t>
-      </w:r>
-      <w:r>
-        <w:t xml:space="preserve">) and the group (</w:t>
-      </w:r>
-      <w:r>
-        <w:rPr>
-          <w:rStyle w:val="VerbatimChar"/>
-        </w:rPr>
-        <w:t xml:space="preserve">7</w:t>
-      </w:r>
-      <w:r>
-        <w:t xml:space="preserve">) and nothing to others (</w:t>
-      </w:r>
-      <w:r>
-        <w:rPr>
-          <w:rStyle w:val="VerbatimChar"/>
-        </w:rPr>
-        <w:t xml:space="preserve">0</w:t>
-      </w:r>
-      <w:r>
-        <w:t xml:space="preserve">). The leading</w:t>
-      </w:r>
-      <w:r>
-        <w:t xml:space="preserve"> </w:t>
-      </w:r>
-      <w:r>
-        <w:rPr>
-          <w:rStyle w:val="VerbatimChar"/>
-        </w:rPr>
-        <w:t xml:space="preserve">1</w:t>
-      </w:r>
-      <w:r>
-        <w:t xml:space="preserve"> </w:t>
-      </w:r>
-      <w:r>
-        <w:t xml:space="preserve">is the sticky bit, which means only the owner of a file can delete it from the directory.</w:t>
+        <w:t xml:space="preserve">(e) Create a directory:</w:t>
+      </w:r>
+      <w:r>
+        <w:t xml:space="preserve"> </w:t>
+      </w:r>
+      <w:r>
+        <w:rPr>
+          <w:rStyle w:val="VerbatimChar"/>
+        </w:rPr>
+        <w:t xml:space="preserve">mkdir /&lt;username&gt;</w:t>
+      </w:r>
+      <w:r>
+        <w:t xml:space="preserve"> </w:t>
+      </w:r>
+      <w:r>
+        <w:t xml:space="preserve">creates a folder at the root with the same name as the user.</w:t>
       </w:r>
     </w:p>
     <w:p>
       <w:pPr>
         <w:numPr>
           <w:ilvl w:val="0"/>
-          <w:numId w:val="1004"/>
+          <w:numId w:val="1009"/>
         </w:numPr>
         <w:pStyle w:val="Compact"/>
       </w:pPr>
@@ -2666,62 +3345,29 @@
           <w:bCs/>
           <w:b/>
         </w:rPr>
-        <w:t xml:space="preserve">Summary.</w:t>
-      </w:r>
-      <w:r>
-        <w:t xml:space="preserve"> </w:t>
-      </w:r>
-      <w:r>
-        <w:t xml:space="preserve">Prints</w:t>
-      </w:r>
-      <w:r>
-        <w:t xml:space="preserve"> </w:t>
-      </w:r>
-      <w:r>
-        <w:rPr>
-          <w:rStyle w:val="VerbatimChar"/>
-        </w:rPr>
-        <w:t xml:space="preserve">id</w:t>
-      </w:r>
-      <w:r>
-        <w:t xml:space="preserve">, the</w:t>
-      </w:r>
-      <w:r>
-        <w:t xml:space="preserve"> </w:t>
-      </w:r>
-      <w:r>
-        <w:rPr>
-          <w:rStyle w:val="VerbatimChar"/>
-        </w:rPr>
-        <w:t xml:space="preserve">/etc/passwd</w:t>
-      </w:r>
-      <w:r>
-        <w:t xml:space="preserve"> </w:t>
-      </w:r>
-      <w:r>
-        <w:t xml:space="preserve">entry and</w:t>
-      </w:r>
-      <w:r>
-        <w:t xml:space="preserve"> </w:t>
-      </w:r>
-      <w:r>
-        <w:rPr>
-          <w:rStyle w:val="VerbatimChar"/>
-        </w:rPr>
-        <w:t xml:space="preserve">ls -ld</w:t>
-      </w:r>
-      <w:r>
-        <w:t xml:space="preserve"> </w:t>
-      </w:r>
-      <w:r>
-        <w:t xml:space="preserve">of the directory as proof.</w:t>
+        <w:t xml:space="preserve">(f) Ownership:</w:t>
+      </w:r>
+      <w:r>
+        <w:t xml:space="preserve"> </w:t>
+      </w:r>
+      <w:r>
+        <w:rPr>
+          <w:rStyle w:val="VerbatimChar"/>
+        </w:rPr>
+        <w:t xml:space="preserve">chown &lt;user&gt;:&lt;group&gt; /&lt;username&gt;</w:t>
+      </w:r>
+      <w:r>
+        <w:t xml:space="preserve"> </w:t>
+      </w:r>
+      <w:r>
+        <w:t xml:space="preserve">gives the folder to the new user and group.</w:t>
       </w:r>
     </w:p>
     <w:p>
       <w:pPr>
         <w:numPr>
           <w:ilvl w:val="0"/>
-          <w:numId w:val="1004"/>
+          <w:numId w:val="1009"/>
         </w:numPr>
         <w:pStyle w:val="Compact"/>
       </w:pPr>
@@ -2730,13 +3376,44 @@
           <w:bCs/>
           <w:b/>
         </w:rPr>
-        <w:t xml:space="preserve">(i) Executable.</w:t>
-      </w:r>
-      <w:r>
-        <w:t xml:space="preserve"> </w:t>
-      </w:r>
-      <w:r>
-        <w:t xml:space="preserve">The script is made executable with</w:t>
+        <w:t xml:space="preserve">(g + h) Permissions:</w:t>
+      </w:r>
+      <w:r>
+        <w:t xml:space="preserve"> </w:t>
+      </w:r>
+      <w:r>
+        <w:rPr>
+          <w:rStyle w:val="VerbatimChar"/>
+        </w:rPr>
+        <w:t xml:space="preserve">chmod 1770 /&lt;username&gt;</w:t>
+      </w:r>
+      <w:r>
+        <w:t xml:space="preserve"> </w:t>
+      </w:r>
+      <w:r>
+        <w:t xml:space="preserve">gives full control to the owner and the group, no access to others, and sets the sticky bit so only the owner of a file can delete it.</w:t>
+      </w:r>
+    </w:p>
+    <w:p>
+      <w:pPr>
+        <w:numPr>
+          <w:ilvl w:val="0"/>
+          <w:numId w:val="1009"/>
+        </w:numPr>
+        <w:pStyle w:val="Compact"/>
+      </w:pPr>
+      <w:r>
+        <w:rPr>
+          <w:bCs/>
+          <w:b/>
+        </w:rPr>
+        <w:t xml:space="preserve">(i) Executable:</w:t>
+      </w:r>
+      <w:r>
+        <w:t xml:space="preserve"> </w:t>
+      </w:r>
+      <w:r>
+        <w:t xml:space="preserve">We make the script executable with</w:t>
       </w:r>
       <w:r>
         <w:t xml:space="preserve"> </w:t>
@@ -2751,7 +3428,7 @@
         <w:t xml:space="preserve"> </w:t>
       </w:r>
       <w:r>
-        <w:t xml:space="preserve">and run as</w:t>
+        <w:t xml:space="preserve">and run it with</w:t>
       </w:r>
       <w:r>
         <w:t xml:space="preserve"> </w:t>
@@ -2763,32 +3440,64 @@
         <w:t xml:space="preserve">./usermgmt.sh</w:t>
       </w:r>
       <w:r>
-        <w:t xml:space="preserve"> </w:t>
-      </w:r>
-      <w:r>
-        <w:t xml:space="preserve">(or</w:t>
-      </w:r>
-      <w:r>
-        <w:t xml:space="preserve"> </w:t>
-      </w:r>
-      <w:r>
-        <w:rPr>
-          <w:rStyle w:val="VerbatimChar"/>
-        </w:rPr>
-        <w:t xml:space="preserve">sudo ./usermgmt.sh</w:t>
-      </w:r>
-      <w:r>
-        <w:t xml:space="preserve">).</w:t>
+        <w:t xml:space="preserve">.</w:t>
+      </w:r>
+    </w:p>
+    <w:p>
+      <w:pPr>
+        <w:pStyle w:val="FirstParagraph"/>
+      </w:pPr>
+      <w:r>
+        <w:t xml:space="preserve">At the end, the script prints a summary with</w:t>
+      </w:r>
+      <w:r>
+        <w:t xml:space="preserve"> </w:t>
+      </w:r>
+      <w:r>
+        <w:rPr>
+          <w:rStyle w:val="VerbatimChar"/>
+        </w:rPr>
+        <w:t xml:space="preserve">id</w:t>
+      </w:r>
+      <w:r>
+        <w:t xml:space="preserve">,</w:t>
+      </w:r>
+      <w:r>
+        <w:t xml:space="preserve"> </w:t>
+      </w:r>
+      <w:r>
+        <w:rPr>
+          <w:rStyle w:val="VerbatimChar"/>
+        </w:rPr>
+        <w:t xml:space="preserve">/etc/passwd</w:t>
+      </w:r>
+      <w:r>
+        <w:t xml:space="preserve"> </w:t>
+      </w:r>
+      <w:r>
+        <w:t xml:space="preserve">and</w:t>
+      </w:r>
+      <w:r>
+        <w:t xml:space="preserve"> </w:t>
+      </w:r>
+      <w:r>
+        <w:rPr>
+          <w:rStyle w:val="VerbatimChar"/>
+        </w:rPr>
+        <w:t xml:space="preserve">ls -ld</w:t>
+      </w:r>
+      <w:r>
+        <w:t xml:space="preserve">, which shows that everything worked.</w:t>
       </w:r>
     </w:p>
     <w:bookmarkEnd w:id="61"/>
-    <w:bookmarkStart w:id="68" w:name="script-implementation"/>
+    <w:bookmarkStart w:id="68" w:name="the-script"/>
     <w:p>
       <w:pPr>
         <w:pStyle w:val="Heading2"/>
       </w:pPr>
       <w:r>
-        <w:t xml:space="preserve">Script implementation</w:t>
+        <w:t xml:space="preserve">The script</w:t>
       </w:r>
     </w:p>
     <w:p>
@@ -2886,22 +3595,22 @@
       </w:r>
     </w:p>
     <w:bookmarkEnd w:id="68"/>
-    <w:bookmarkStart w:id="88" w:name="testing"/>
+    <w:bookmarkStart w:id="88" w:name="tests"/>
     <w:p>
       <w:pPr>
         <w:pStyle w:val="Heading2"/>
       </w:pPr>
       <w:r>
-        <w:t xml:space="preserve">Testing</w:t>
-      </w:r>
-    </w:p>
-    <w:bookmarkStart w:id="72" w:name="i-making-the-script-executable"/>
+        <w:t xml:space="preserve">Tests</w:t>
+      </w:r>
+    </w:p>
+    <w:bookmarkStart w:id="72" w:name="test-1-making-the-script-executable-i"/>
     <w:p>
       <w:pPr>
         <w:pStyle w:val="Heading3"/>
       </w:pPr>
       <w:r>
-        <w:t xml:space="preserve">(i) Making the script executable</w:t>
+        <w:t xml:space="preserve">Test 1 – Making the script executable (i)</w:t>
       </w:r>
     </w:p>
     <w:p>
@@ -2921,22 +3630,10 @@
         <w:t xml:space="preserve">chmod +x</w:t>
       </w:r>
       <w:r>
-        <w:t xml:space="preserve">, the file has no</w:t>
-      </w:r>
-      <w:r>
-        <w:t xml:space="preserve"> </w:t>
-      </w:r>
-      <w:r>
-        <w:rPr>
-          <w:rStyle w:val="VerbatimChar"/>
-        </w:rPr>
-        <w:t xml:space="preserve">x</w:t>
-      </w:r>
-      <w:r>
-        <w:t xml:space="preserve"> </w:t>
-      </w:r>
-      <w:r>
-        <w:t xml:space="preserve">bits (</w:t>
+        <w:t xml:space="preserve">, the file is</w:t>
+      </w:r>
+      <w:r>
+        <w:t xml:space="preserve"> </w:t>
       </w:r>
       <w:r>
         <w:rPr>
@@ -2945,7 +3642,22 @@
         <w:t xml:space="preserve">-rw-r--r--</w:t>
       </w:r>
       <w:r>
-        <w:t xml:space="preserve">). Afterwards it is executable (</w:t>
+        <w:t xml:space="preserve">, so it cannot run. After</w:t>
+      </w:r>
+      <w:r>
+        <w:t xml:space="preserve"> </w:t>
+      </w:r>
+      <w:r>
+        <w:rPr>
+          <w:rStyle w:val="VerbatimChar"/>
+        </w:rPr>
+        <w:t xml:space="preserve">chmod +x</w:t>
+      </w:r>
+      <w:r>
+        <w:t xml:space="preserve">, it is</w:t>
+      </w:r>
+      <w:r>
+        <w:t xml:space="preserve"> </w:t>
       </w:r>
       <w:r>
         <w:rPr>
@@ -2954,7 +3666,7 @@
         <w:t xml:space="preserve">-rwxr-xr-x</w:t>
       </w:r>
       <w:r>
-        <w:t xml:space="preserve">).</w:t>
+        <w:t xml:space="preserve">, so it is executable.</w:t>
       </w:r>
     </w:p>
     <w:p>
@@ -3005,13 +3717,13 @@
       </w:r>
     </w:p>
     <w:bookmarkEnd w:id="72"/>
-    <w:bookmarkStart w:id="76" w:name="X350497e781a435b01f781dfb44947fa797eeb00"/>
+    <w:bookmarkStart w:id="76" w:name="Xe1d9b75b9edbccf22aff15a3481fbbcae5313f7"/>
     <w:p>
       <w:pPr>
         <w:pStyle w:val="Heading3"/>
       </w:pPr>
       <w:r>
-        <w:t xml:space="preserve">Test 1: Duplicate group, duplicate user, wrong password, then valid input</w:t>
+        <w:t xml:space="preserve">Test 2 – Wrong input and then correct input (a–h)</w:t>
       </w:r>
     </w:p>
     <w:p>
@@ -3019,148 +3731,359 @@
         <w:pStyle w:val="FirstParagraph"/>
       </w:pPr>
       <w:r>
-        <w:t xml:space="preserve">This run tests every error branch:</w:t>
-      </w:r>
-    </w:p>
-    <w:p>
-      <w:pPr>
-        <w:numPr>
-          <w:ilvl w:val="0"/>
-          <w:numId w:val="1005"/>
-        </w:numPr>
-        <w:pStyle w:val="Compact"/>
-      </w:pPr>
-      <w:r>
-        <w:rPr>
-          <w:bCs/>
-          <w:b/>
-        </w:rPr>
-        <w:t xml:space="preserve">(a)</w:t>
-      </w:r>
-      <w:r>
-        <w:t xml:space="preserve"> </w:t>
-      </w:r>
-      <w:r>
-        <w:rPr>
-          <w:rStyle w:val="VerbatimChar"/>
-        </w:rPr>
-        <w:t xml:space="preserve">HR</w:t>
-      </w:r>
-      <w:r>
-        <w:t xml:space="preserve"> </w:t>
-      </w:r>
-      <w:r>
-        <w:t xml:space="preserve">already exists, so the script reports an error and asks again.</w:t>
-      </w:r>
-      <w:r>
-        <w:t xml:space="preserve"> </w:t>
-      </w:r>
-      <w:r>
-        <w:rPr>
-          <w:rStyle w:val="VerbatimChar"/>
-        </w:rPr>
-        <w:t xml:space="preserve">Marketing</w:t>
-      </w:r>
-      <w:r>
-        <w:t xml:space="preserve"> </w:t>
-      </w:r>
-      <w:r>
-        <w:t xml:space="preserve">is accepted.</w:t>
-      </w:r>
-    </w:p>
-    <w:p>
-      <w:pPr>
-        <w:numPr>
-          <w:ilvl w:val="0"/>
-          <w:numId w:val="1005"/>
-        </w:numPr>
-        <w:pStyle w:val="Compact"/>
-      </w:pPr>
-      <w:r>
-        <w:rPr>
-          <w:bCs/>
-          <w:b/>
-        </w:rPr>
-        <w:t xml:space="preserve">(b)</w:t>
-      </w:r>
-      <w:r>
-        <w:t xml:space="preserve"> </w:t>
-      </w:r>
-      <w:r>
-        <w:rPr>
-          <w:rStyle w:val="VerbatimChar"/>
-        </w:rPr>
-        <w:t xml:space="preserve">eng_admin</w:t>
-      </w:r>
-      <w:r>
-        <w:t xml:space="preserve"> </w:t>
-      </w:r>
-      <w:r>
-        <w:t xml:space="preserve">already exists, so the script reports an error.</w:t>
-      </w:r>
-      <w:r>
-        <w:t xml:space="preserve"> </w:t>
-      </w:r>
-      <w:r>
-        <w:rPr>
-          <w:rStyle w:val="VerbatimChar"/>
-        </w:rPr>
-        <w:t xml:space="preserve">anna</w:t>
-      </w:r>
-      <w:r>
-        <w:t xml:space="preserve"> </w:t>
-      </w:r>
-      <w:r>
-        <w:t xml:space="preserve">is accepted.</w:t>
-      </w:r>
-    </w:p>
-    <w:p>
-      <w:pPr>
-        <w:numPr>
-          <w:ilvl w:val="0"/>
-          <w:numId w:val="1005"/>
-        </w:numPr>
-        <w:pStyle w:val="Compact"/>
-      </w:pPr>
-      <w:r>
-        <w:rPr>
-          <w:bCs/>
-          <w:b/>
-        </w:rPr>
-        <w:t xml:space="preserve">(c)</w:t>
-      </w:r>
-      <w:r>
-        <w:t xml:space="preserve"> </w:t>
-      </w:r>
-      <w:r>
-        <w:t xml:space="preserve">The two passwords did not match the first time, so the script asks again. The second attempt matched. The password is hidden while typing.</w:t>
-      </w:r>
-    </w:p>
-    <w:p>
-      <w:pPr>
-        <w:numPr>
-          <w:ilvl w:val="0"/>
-          <w:numId w:val="1005"/>
-        </w:numPr>
-        <w:pStyle w:val="Compact"/>
-      </w:pPr>
-      <w:r>
-        <w:rPr>
-          <w:bCs/>
-          <w:b/>
-        </w:rPr>
-        <w:t xml:space="preserve">(d–h)</w:t>
-      </w:r>
-      <w:r>
-        <w:t xml:space="preserve"> </w:t>
-      </w:r>
-      <w:r>
-        <w:t xml:space="preserve">The rest of the script runs, and the summary shows the result.</w:t>
-      </w:r>
-    </w:p>
-    <w:p>
-      <w:pPr>
-        <w:pStyle w:val="FirstParagraph"/>
+        <w:t xml:space="preserve">In this test we try every error case:</w:t>
+      </w:r>
+    </w:p>
+    <w:tbl>
+      <w:tblPr>
+        <w:tblStyle w:val="Table"/>
+        <w:tblW w:type="pct" w:w="5000"/>
+        <w:tblLook w:firstRow="1" w:lastRow="0" w:firstColumn="0" w:lastColumn="0" w:noHBand="0" w:noVBand="0" w:val="0020"/>
+        <w:jc w:val="start"/>
+      </w:tblPr>
+      <w:tblGrid>
+        <w:gridCol w:w="2640"/>
+        <w:gridCol w:w="2640"/>
+        <w:gridCol w:w="2640"/>
+      </w:tblGrid>
+      <w:tr>
+        <w:trPr>
+          <w:tblHeader w:val="true"/>
+        </w:trPr>
+        <w:tc>
+          <w:tcPr/>
+          <w:p>
+            <w:pPr>
+              <w:pStyle w:val="Compact"/>
+              <w:jc w:val="left"/>
+            </w:pPr>
+            <w:r>
+              <w:t xml:space="preserve">We typed</w:t>
+            </w:r>
+          </w:p>
+        </w:tc>
+        <w:tc>
+          <w:tcPr/>
+          <w:p>
+            <w:pPr>
+              <w:pStyle w:val="Compact"/>
+              <w:jc w:val="left"/>
+            </w:pPr>
+            <w:r>
+              <w:t xml:space="preserve">What happened</w:t>
+            </w:r>
+          </w:p>
+        </w:tc>
+        <w:tc>
+          <w:tcPr/>
+          <w:p>
+            <w:pPr>
+              <w:pStyle w:val="Compact"/>
+              <w:jc w:val="left"/>
+            </w:pPr>
+            <w:r>
+              <w:t xml:space="preserve">Task</w:t>
+            </w:r>
+          </w:p>
+        </w:tc>
+      </w:tr>
+      <w:tr>
+        <w:tc>
+          <w:tcPr/>
+          <w:p>
+            <w:pPr>
+              <w:pStyle w:val="Compact"/>
+              <w:jc w:val="left"/>
+            </w:pPr>
+            <w:r>
+              <w:rPr>
+                <w:rStyle w:val="VerbatimChar"/>
+              </w:rPr>
+              <w:t xml:space="preserve">HR</w:t>
+            </w:r>
+          </w:p>
+        </w:tc>
+        <w:tc>
+          <w:tcPr/>
+          <w:p>
+            <w:pPr>
+              <w:pStyle w:val="Compact"/>
+              <w:jc w:val="left"/>
+            </w:pPr>
+            <w:r>
+              <w:t xml:space="preserve">Error: the group already exists, so the script asks again</w:t>
+            </w:r>
+          </w:p>
+        </w:tc>
+        <w:tc>
+          <w:tcPr/>
+          <w:p>
+            <w:pPr>
+              <w:pStyle w:val="Compact"/>
+              <w:jc w:val="left"/>
+            </w:pPr>
+            <w:r>
+              <w:t xml:space="preserve">a</w:t>
+            </w:r>
+          </w:p>
+        </w:tc>
+      </w:tr>
+      <w:tr>
+        <w:tc>
+          <w:tcPr/>
+          <w:p>
+            <w:pPr>
+              <w:pStyle w:val="Compact"/>
+              <w:jc w:val="left"/>
+            </w:pPr>
+            <w:r>
+              <w:rPr>
+                <w:rStyle w:val="VerbatimChar"/>
+              </w:rPr>
+              <w:t xml:space="preserve">Marketing</w:t>
+            </w:r>
+          </w:p>
+        </w:tc>
+        <w:tc>
+          <w:tcPr/>
+          <w:p>
+            <w:pPr>
+              <w:pStyle w:val="Compact"/>
+              <w:jc w:val="left"/>
+            </w:pPr>
+            <w:r>
+              <w:t xml:space="preserve">The group is created</w:t>
+            </w:r>
+          </w:p>
+        </w:tc>
+        <w:tc>
+          <w:tcPr/>
+          <w:p>
+            <w:pPr>
+              <w:pStyle w:val="Compact"/>
+              <w:jc w:val="left"/>
+            </w:pPr>
+            <w:r>
+              <w:t xml:space="preserve">a</w:t>
+            </w:r>
+          </w:p>
+        </w:tc>
+      </w:tr>
+      <w:tr>
+        <w:tc>
+          <w:tcPr/>
+          <w:p>
+            <w:pPr>
+              <w:pStyle w:val="Compact"/>
+              <w:jc w:val="left"/>
+            </w:pPr>
+            <w:r>
+              <w:rPr>
+                <w:rStyle w:val="VerbatimChar"/>
+              </w:rPr>
+              <w:t xml:space="preserve">eng_admin</w:t>
+            </w:r>
+          </w:p>
+        </w:tc>
+        <w:tc>
+          <w:tcPr/>
+          <w:p>
+            <w:pPr>
+              <w:pStyle w:val="Compact"/>
+              <w:jc w:val="left"/>
+            </w:pPr>
+            <w:r>
+              <w:t xml:space="preserve">Error: the user already exists, so the script asks again</w:t>
+            </w:r>
+          </w:p>
+        </w:tc>
+        <w:tc>
+          <w:tcPr/>
+          <w:p>
+            <w:pPr>
+              <w:pStyle w:val="Compact"/>
+              <w:jc w:val="left"/>
+            </w:pPr>
+            <w:r>
+              <w:t xml:space="preserve">b</w:t>
+            </w:r>
+          </w:p>
+        </w:tc>
+      </w:tr>
+      <w:tr>
+        <w:tc>
+          <w:tcPr/>
+          <w:p>
+            <w:pPr>
+              <w:pStyle w:val="Compact"/>
+              <w:jc w:val="left"/>
+            </w:pPr>
+            <w:r>
+              <w:rPr>
+                <w:rStyle w:val="VerbatimChar"/>
+              </w:rPr>
+              <w:t xml:space="preserve">anna</w:t>
+            </w:r>
+          </w:p>
+        </w:tc>
+        <w:tc>
+          <w:tcPr/>
+          <w:p>
+            <w:pPr>
+              <w:pStyle w:val="Compact"/>
+              <w:jc w:val="left"/>
+            </w:pPr>
+            <w:r>
+              <w:t xml:space="preserve">The user is created</w:t>
+            </w:r>
+          </w:p>
+        </w:tc>
+        <w:tc>
+          <w:tcPr/>
+          <w:p>
+            <w:pPr>
+              <w:pStyle w:val="Compact"/>
+              <w:jc w:val="left"/>
+            </w:pPr>
+            <w:r>
+              <w:t xml:space="preserve">b</w:t>
+            </w:r>
+          </w:p>
+        </w:tc>
+      </w:tr>
+      <w:tr>
+        <w:tc>
+          <w:tcPr/>
+          <w:p>
+            <w:pPr>
+              <w:pStyle w:val="Compact"/>
+              <w:jc w:val="left"/>
+            </w:pPr>
+            <w:r>
+              <w:t xml:space="preserve">Two different passwords</w:t>
+            </w:r>
+          </w:p>
+        </w:tc>
+        <w:tc>
+          <w:tcPr/>
+          <w:p>
+            <w:pPr>
+              <w:pStyle w:val="Compact"/>
+              <w:jc w:val="left"/>
+            </w:pPr>
+            <w:r>
+              <w:t xml:space="preserve">Error: the passwords do not match, so the script asks again</w:t>
+            </w:r>
+          </w:p>
+        </w:tc>
+        <w:tc>
+          <w:tcPr/>
+          <w:p>
+            <w:pPr>
+              <w:pStyle w:val="Compact"/>
+              <w:jc w:val="left"/>
+            </w:pPr>
+            <w:r>
+              <w:t xml:space="preserve">c</w:t>
+            </w:r>
+          </w:p>
+        </w:tc>
+      </w:tr>
+      <w:tr>
+        <w:tc>
+          <w:tcPr/>
+          <w:p>
+            <w:pPr>
+              <w:pStyle w:val="Compact"/>
+              <w:jc w:val="left"/>
+            </w:pPr>
+            <w:r>
+              <w:t xml:space="preserve">The same password twice</w:t>
+            </w:r>
+          </w:p>
+        </w:tc>
+        <w:tc>
+          <w:tcPr/>
+          <w:p>
+            <w:pPr>
+              <w:pStyle w:val="Compact"/>
+              <w:jc w:val="left"/>
+            </w:pPr>
+            <w:r>
+              <w:t xml:space="preserve">The password is set</w:t>
+            </w:r>
+          </w:p>
+        </w:tc>
+        <w:tc>
+          <w:tcPr/>
+          <w:p>
+            <w:pPr>
+              <w:pStyle w:val="Compact"/>
+              <w:jc w:val="left"/>
+            </w:pPr>
+            <w:r>
+              <w:t xml:space="preserve">c</w:t>
+            </w:r>
+          </w:p>
+        </w:tc>
+      </w:tr>
+    </w:tbl>
+    <w:p>
+      <w:pPr>
+        <w:pStyle w:val="BodyText"/>
+      </w:pPr>
+      <w:r>
+        <w:t xml:space="preserve">Then the script makes anna a member of Marketing (d), creates</w:t>
+      </w:r>
+      <w:r>
+        <w:t xml:space="preserve"> </w:t>
+      </w:r>
+      <w:r>
+        <w:rPr>
+          <w:rStyle w:val="VerbatimChar"/>
+        </w:rPr>
+        <w:t xml:space="preserve">/anna</w:t>
+      </w:r>
+      <w:r>
+        <w:t xml:space="preserve"> </w:t>
+      </w:r>
+      <w:r>
+        <w:t xml:space="preserve">(e), sets owner</w:t>
+      </w:r>
+      <w:r>
+        <w:t xml:space="preserve"> </w:t>
+      </w:r>
+      <w:r>
+        <w:rPr>
+          <w:rStyle w:val="VerbatimChar"/>
+        </w:rPr>
+        <w:t xml:space="preserve">anna:Marketing</w:t>
+      </w:r>
+      <w:r>
+        <w:t xml:space="preserve"> </w:t>
+      </w:r>
+      <w:r>
+        <w:t xml:space="preserve">(f) and sets the permissions</w:t>
+      </w:r>
+      <w:r>
+        <w:t xml:space="preserve"> </w:t>
+      </w:r>
+      <w:r>
+        <w:rPr>
+          <w:rStyle w:val="VerbatimChar"/>
+        </w:rPr>
+        <w:t xml:space="preserve">drwxrwx--T</w:t>
+      </w:r>
+      <w:r>
+        <w:t xml:space="preserve"> </w:t>
+      </w:r>
+      <w:r>
+        <w:t xml:space="preserve">(g, h).</w:t>
+      </w:r>
+    </w:p>
+    <w:p>
+      <w:pPr>
+        <w:pStyle w:val="BodyText"/>
       </w:pPr>
       <w:r>
         <w:drawing>
@@ -3206,20 +4129,20 @@
       </w:r>
     </w:p>
     <w:bookmarkEnd w:id="76"/>
-    <w:bookmarkStart w:id="80" w:name="verification-of-test-1"/>
+    <w:bookmarkStart w:id="80" w:name="test-3-checking-the-result"/>
     <w:p>
       <w:pPr>
         <w:pStyle w:val="Heading3"/>
       </w:pPr>
       <w:r>
-        <w:t xml:space="preserve">Verification of Test 1</w:t>
+        <w:t xml:space="preserve">Test 3 – Checking the result</w:t>
       </w:r>
     </w:p>
     <w:p>
       <w:pPr>
         <w:numPr>
           <w:ilvl w:val="0"/>
-          <w:numId w:val="1006"/>
+          <w:numId w:val="1010"/>
         </w:numPr>
         <w:pStyle w:val="Compact"/>
       </w:pPr>
@@ -3233,31 +4156,17 @@
         <w:t xml:space="preserve"> </w:t>
       </w:r>
       <w:r>
-        <w:t xml:space="preserve">lists</w:t>
-      </w:r>
-      <w:r>
-        <w:t xml:space="preserve"> </w:t>
-      </w:r>
-      <w:r>
-        <w:rPr>
-          <w:rStyle w:val="VerbatimChar"/>
-        </w:rPr>
-        <w:t xml:space="preserve">anna</w:t>
-      </w:r>
-      <w:r>
-        <w:t xml:space="preserve"> </w:t>
-      </w:r>
-      <w:r>
-        <w:t xml:space="preserve">as a member of</w:t>
-      </w:r>
-      <w:r>
-        <w:t xml:space="preserve"> </w:t>
-      </w:r>
-      <w:r>
-        <w:rPr>
-          <w:rStyle w:val="VerbatimChar"/>
-        </w:rPr>
-        <w:t xml:space="preserve">Marketing</w:t>
+        <w:t xml:space="preserve">shows that</w:t>
+      </w:r>
+      <w:r>
+        <w:t xml:space="preserve"> </w:t>
+      </w:r>
+      <w:r>
+        <w:rPr>
+          <w:bCs/>
+          <w:b/>
+        </w:rPr>
+        <w:t xml:space="preserve">anna is a member of Marketing</w:t>
       </w:r>
       <w:r>
         <w:t xml:space="preserve"> </w:t>
@@ -3270,7 +4179,7 @@
       <w:pPr>
         <w:numPr>
           <w:ilvl w:val="0"/>
-          <w:numId w:val="1006"/>
+          <w:numId w:val="1010"/>
         </w:numPr>
         <w:pStyle w:val="Compact"/>
       </w:pPr>
@@ -3299,31 +4208,33 @@
         <w:t xml:space="preserve"> </w:t>
       </w:r>
       <w:r>
-        <w:t xml:space="preserve">show that the primary group is</w:t>
-      </w:r>
-      <w:r>
-        <w:t xml:space="preserve"> </w:t>
-      </w:r>
-      <w:r>
-        <w:rPr>
-          <w:rStyle w:val="VerbatimChar"/>
-        </w:rPr>
-        <w:t xml:space="preserve">Marketing</w:t>
-      </w:r>
-      <w:r>
-        <w:t xml:space="preserve"> </w:t>
-      </w:r>
-      <w:r>
-        <w:t xml:space="preserve">and the shell is</w:t>
-      </w:r>
-      <w:r>
-        <w:t xml:space="preserve"> </w:t>
-      </w:r>
-      <w:r>
-        <w:rPr>
-          <w:rStyle w:val="VerbatimChar"/>
-        </w:rPr>
-        <w:t xml:space="preserve">/bin/bash</w:t>
+        <w:t xml:space="preserve">show that the</w:t>
+      </w:r>
+      <w:r>
+        <w:t xml:space="preserve"> </w:t>
+      </w:r>
+      <w:r>
+        <w:rPr>
+          <w:bCs/>
+          <w:b/>
+        </w:rPr>
+        <w:t xml:space="preserve">primary group is Marketing</w:t>
+      </w:r>
+      <w:r>
+        <w:t xml:space="preserve"> </w:t>
+      </w:r>
+      <w:r>
+        <w:t xml:space="preserve">and the</w:t>
+      </w:r>
+      <w:r>
+        <w:t xml:space="preserve"> </w:t>
+      </w:r>
+      <w:r>
+        <w:rPr>
+          <w:bCs/>
+          <w:b/>
+        </w:rPr>
+        <w:t xml:space="preserve">shell is /bin/bash</w:t>
       </w:r>
       <w:r>
         <w:t xml:space="preserve"> </w:t>
@@ -3336,7 +4247,7 @@
       <w:pPr>
         <w:numPr>
           <w:ilvl w:val="0"/>
-          <w:numId w:val="1006"/>
+          <w:numId w:val="1010"/>
         </w:numPr>
         <w:pStyle w:val="Compact"/>
       </w:pPr>
@@ -3350,16 +4261,17 @@
         <w:t xml:space="preserve"> </w:t>
       </w:r>
       <w:r>
-        <w:t xml:space="preserve">contains a password hash for</w:t>
-      </w:r>
-      <w:r>
-        <w:t xml:space="preserve"> </w:t>
-      </w:r>
-      <w:r>
-        <w:rPr>
-          <w:rStyle w:val="VerbatimChar"/>
-        </w:rPr>
-        <w:t xml:space="preserve">anna</w:t>
+        <w:t xml:space="preserve">shows that</w:t>
+      </w:r>
+      <w:r>
+        <w:t xml:space="preserve"> </w:t>
+      </w:r>
+      <w:r>
+        <w:rPr>
+          <w:bCs/>
+          <w:b/>
+        </w:rPr>
+        <w:t xml:space="preserve">a password is saved</w:t>
       </w:r>
       <w:r>
         <w:t xml:space="preserve"> </w:t>
@@ -3372,7 +4284,7 @@
       <w:pPr>
         <w:numPr>
           <w:ilvl w:val="0"/>
-          <w:numId w:val="1006"/>
+          <w:numId w:val="1010"/>
         </w:numPr>
         <w:pStyle w:val="Compact"/>
       </w:pPr>
@@ -3386,14 +4298,15 @@
         <w:t xml:space="preserve"> </w:t>
       </w:r>
       <w:r>
-        <w:t xml:space="preserve">exists at the root (e), is owned by</w:t>
-      </w:r>
-      <w:r>
-        <w:t xml:space="preserve"> </w:t>
-      </w:r>
-      <w:r>
-        <w:rPr>
-          <w:rStyle w:val="VerbatimChar"/>
+        <w:t xml:space="preserve">exists (e), is owned by</w:t>
+      </w:r>
+      <w:r>
+        <w:t xml:space="preserve"> </w:t>
+      </w:r>
+      <w:r>
+        <w:rPr>
+          <w:bCs/>
+          <w:b/>
         </w:rPr>
         <w:t xml:space="preserve">anna:Marketing</w:t>
       </w:r>
@@ -3401,16 +4314,17 @@
         <w:t xml:space="preserve"> </w:t>
       </w:r>
       <w:r>
-        <w:t xml:space="preserve">(f) and has permissions</w:t>
-      </w:r>
-      <w:r>
-        <w:t xml:space="preserve"> </w:t>
-      </w:r>
-      <w:r>
-        <w:rPr>
-          <w:rStyle w:val="VerbatimChar"/>
-        </w:rPr>
-        <w:t xml:space="preserve">drwxrwx--T</w:t>
+        <w:t xml:space="preserve">(f) and has</w:t>
+      </w:r>
+      <w:r>
+        <w:t xml:space="preserve"> </w:t>
+      </w:r>
+      <w:r>
+        <w:rPr>
+          <w:bCs/>
+          <w:b/>
+        </w:rPr>
+        <w:t xml:space="preserve">drwxrwx–T</w:t>
       </w:r>
       <w:r>
         <w:t xml:space="preserve"> </w:t>
@@ -3423,21 +4337,41 @@
       <w:pPr>
         <w:numPr>
           <w:ilvl w:val="0"/>
-          <w:numId w:val="1006"/>
+          <w:numId w:val="1010"/>
         </w:numPr>
         <w:pStyle w:val="Compact"/>
       </w:pPr>
       <w:r>
-        <w:rPr>
-          <w:rStyle w:val="VerbatimChar"/>
-        </w:rPr>
         <w:t xml:space="preserve">anna</w:t>
       </w:r>
       <w:r>
         <w:t xml:space="preserve"> </w:t>
       </w:r>
       <w:r>
-        <w:t xml:space="preserve">can create files in it, and a user outside the group is denied access.</w:t>
+        <w:rPr>
+          <w:bCs/>
+          <w:b/>
+        </w:rPr>
+        <w:t xml:space="preserve">can create files</w:t>
+      </w:r>
+      <w:r>
+        <w:t xml:space="preserve"> </w:t>
+      </w:r>
+      <w:r>
+        <w:t xml:space="preserve">in her folder, and</w:t>
+      </w:r>
+      <w:r>
+        <w:t xml:space="preserve"> </w:t>
+      </w:r>
+      <w:r>
+        <w:rPr>
+          <w:bCs/>
+          <w:b/>
+        </w:rPr>
+        <w:t xml:space="preserve">other users are denied</w:t>
+      </w:r>
+      <w:r>
+        <w:t xml:space="preserve">.</w:t>
       </w:r>
     </w:p>
     <w:p>
@@ -3488,13 +4422,13 @@
       </w:r>
     </w:p>
     <w:bookmarkEnd w:id="80"/>
-    <w:bookmarkStart w:id="87" w:name="test-2-a-second-run-with-other-names"/>
+    <w:bookmarkStart w:id="87" w:name="Xfcbf74133f125eacd967252679500f16b1fda11"/>
     <w:p>
       <w:pPr>
         <w:pStyle w:val="Heading3"/>
       </w:pPr>
       <w:r>
-        <w:t xml:space="preserve">Test 2: A second run with other names</w:t>
+        <w:t xml:space="preserve">Test 4 – Running the script again with other names</w:t>
       </w:r>
     </w:p>
     <w:p>
@@ -3502,7 +4436,50 @@
         <w:pStyle w:val="FirstParagraph"/>
       </w:pPr>
       <w:r>
-        <w:t xml:space="preserve">This run shows that the script accepts any names. It also tests an empty group name, and the group and user created in Test 1 are now rejected as duplicates.</w:t>
+        <w:t xml:space="preserve">This shows that the script works for</w:t>
+      </w:r>
+      <w:r>
+        <w:t xml:space="preserve"> </w:t>
+      </w:r>
+      <w:r>
+        <w:rPr>
+          <w:bCs/>
+          <w:b/>
+        </w:rPr>
+        <w:t xml:space="preserve">any names</w:t>
+      </w:r>
+      <w:r>
+        <w:t xml:space="preserve">. It also tests an empty group name, and it shows that</w:t>
+      </w:r>
+      <w:r>
+        <w:t xml:space="preserve"> </w:t>
+      </w:r>
+      <w:r>
+        <w:rPr>
+          <w:rStyle w:val="VerbatimChar"/>
+        </w:rPr>
+        <w:t xml:space="preserve">Marketing</w:t>
+      </w:r>
+      <w:r>
+        <w:t xml:space="preserve"> </w:t>
+      </w:r>
+      <w:r>
+        <w:t xml:space="preserve">and</w:t>
+      </w:r>
+      <w:r>
+        <w:t xml:space="preserve"> </w:t>
+      </w:r>
+      <w:r>
+        <w:rPr>
+          <w:rStyle w:val="VerbatimChar"/>
+        </w:rPr>
+        <w:t xml:space="preserve">anna</w:t>
+      </w:r>
+      <w:r>
+        <w:t xml:space="preserve"> </w:t>
+      </w:r>
+      <w:r>
+        <w:t xml:space="preserve">are now rejected because they already exist.</w:t>
       </w:r>
     </w:p>
     <w:p>
@@ -3626,7 +4603,7 @@
         <w:t xml:space="preserve"> </w:t>
       </w:r>
       <w:r>
-        <w:t xml:space="preserve">every department has a private directory owned by its administrator and group. All department members have full access, files can only be deleted by their owner, and other users have no access. Each directory has a confidential file that only the administrator can modify and that department members can read.</w:t>
+        <w:t xml:space="preserve">Every department has its own folder, owned by its admin and its group. Everyone in the department has full access, but files can only be deleted by their owner (sticky bit). Users from other departments have no access. Each folder has a confidential file that the department can read but only the admin can change.</w:t>
       </w:r>
     </w:p>
     <w:p>
@@ -3644,7 +4621,7 @@
         <w:t xml:space="preserve"> </w:t>
       </w:r>
       <w:r>
-        <w:t xml:space="preserve">the script automates the same work for any group and user name. It validates input with</w:t>
+        <w:t xml:space="preserve">Our script does the same work automatically for any group and user name. It checks for duplicates with</w:t>
       </w:r>
       <w:r>
         <w:t xml:space="preserve"> </w:t>
@@ -3671,10 +4648,15 @@
         <w:t xml:space="preserve">$?</w:t>
       </w:r>
       <w:r>
-        <w:t xml:space="preserve"> </w:t>
-      </w:r>
-      <w:r>
-        <w:t xml:space="preserve">so duplicates are rejected, and it produces a correctly configured user and directory every time.</w:t>
+        <w:t xml:space="preserve">, asks again when something is wrong, and always creates a correctly set up user and folder.</w:t>
+      </w:r>
+    </w:p>
+    <w:p>
+      <w:pPr>
+        <w:pStyle w:val="BodyText"/>
+      </w:pPr>
+      <w:r>
+        <w:t xml:space="preserve">All tests worked as expected. The video presentation shows every step live.</w:t>
       </w:r>
     </w:p>
     <w:bookmarkEnd w:id="90"/>
@@ -3860,11 +4842,11 @@
       </w:pPr>
     </w:lvl>
   </w:abstractNum>
-  <w:abstractNum w:abstractNumId="99410">
-    <w:nsid w:val="A99410"/>
+  <w:abstractNum w:abstractNumId="99411">
+    <w:nsid w:val="A99411"/>
     <w:multiLevelType w:val="multilevel"/>
     <w:lvl w:ilvl="0">
-      <w:start w:val="0"/>
+      <w:start w:val="1"/>
       <w:numFmt w:val="decimal"/>
       <w:lvlText w:val="%1."/>
       <w:lvlJc w:val="left"/>
@@ -3873,7 +4855,7 @@
       </w:pPr>
     </w:lvl>
     <w:lvl w:ilvl="1">
-      <w:start w:val="0"/>
+      <w:start w:val="1"/>
       <w:numFmt w:val="decimal"/>
       <w:lvlText w:val="%2."/>
       <w:lvlJc w:val="left"/>
@@ -3882,7 +4864,7 @@
       </w:pPr>
     </w:lvl>
     <w:lvl w:ilvl="2">
-      <w:start w:val="0"/>
+      <w:start w:val="1"/>
       <w:numFmt w:val="decimal"/>
       <w:lvlText w:val="%3."/>
       <w:lvlJc w:val="left"/>
@@ -3891,7 +4873,7 @@
       </w:pPr>
     </w:lvl>
     <w:lvl w:ilvl="3">
-      <w:start w:val="0"/>
+      <w:start w:val="1"/>
       <w:numFmt w:val="decimal"/>
       <w:lvlText w:val="%4."/>
       <w:lvlJc w:val="left"/>
@@ -3900,7 +4882,7 @@
       </w:pPr>
     </w:lvl>
     <w:lvl w:ilvl="4">
-      <w:start w:val="0"/>
+      <w:start w:val="1"/>
       <w:numFmt w:val="decimal"/>
       <w:lvlText w:val="%5."/>
       <w:lvlJc w:val="left"/>
@@ -3909,7 +4891,7 @@
       </w:pPr>
     </w:lvl>
     <w:lvl w:ilvl="5">
-      <w:start w:val="0"/>
+      <w:start w:val="1"/>
       <w:numFmt w:val="decimal"/>
       <w:lvlText w:val="%6."/>
       <w:lvlJc w:val="left"/>
@@ -3918,7 +4900,7 @@
       </w:pPr>
     </w:lvl>
     <w:lvl w:ilvl="6">
-      <w:start w:val="0"/>
+      <w:start w:val="1"/>
       <w:numFmt w:val="decimal"/>
       <w:lvlText w:val="%7."/>
       <w:lvlJc w:val="left"/>
@@ -3927,7 +4909,7 @@
       </w:pPr>
     </w:lvl>
     <w:lvl w:ilvl="7">
-      <w:start w:val="0"/>
+      <w:start w:val="1"/>
       <w:numFmt w:val="decimal"/>
       <w:lvlText w:val="%8."/>
       <w:lvlJc w:val="left"/>
@@ -3936,7 +4918,7 @@
       </w:pPr>
     </w:lvl>
     <w:lvl w:ilvl="8">
-      <w:start w:val="0"/>
+      <w:start w:val="1"/>
       <w:numFmt w:val="decimal"/>
       <w:lvlText w:val="%9."/>
       <w:lvlJc w:val="left"/>
@@ -3958,40 +4940,133 @@
     <w:abstractNumId w:val="991"/>
   </w:num>
   <w:num w:numId="1004">
-    <w:abstractNumId w:val="99410"/>
+    <w:abstractNumId w:val="991"/>
+  </w:num>
+  <w:num w:numId="1005">
+    <w:abstractNumId w:val="99411"/>
     <w:lvlOverride w:ilvl="0">
-      <w:startOverride w:val="0"/>
+      <w:startOverride w:val="1"/>
     </w:lvlOverride>
     <w:lvlOverride w:ilvl="1">
-      <w:startOverride w:val="0"/>
+      <w:startOverride w:val="1"/>
     </w:lvlOverride>
     <w:lvlOverride w:ilvl="2">
-      <w:startOverride w:val="0"/>
+      <w:startOverride w:val="1"/>
     </w:lvlOverride>
     <w:lvlOverride w:ilvl="3">
-      <w:startOverride w:val="0"/>
+      <w:startOverride w:val="1"/>
     </w:lvlOverride>
     <w:lvlOverride w:ilvl="4">
-      <w:startOverride w:val="0"/>
+      <w:startOverride w:val="1"/>
     </w:lvlOverride>
     <w:lvlOverride w:ilvl="5">
-      <w:startOverride w:val="0"/>
+      <w:startOverride w:val="1"/>
     </w:lvlOverride>
     <w:lvlOverride w:ilvl="6">
-      <w:startOverride w:val="0"/>
+      <w:startOverride w:val="1"/>
     </w:lvlOverride>
     <w:lvlOverride w:ilvl="7">
-      <w:startOverride w:val="0"/>
+      <w:startOverride w:val="1"/>
     </w:lvlOverride>
     <w:lvlOverride w:ilvl="8">
-      <w:startOverride w:val="0"/>
+      <w:startOverride w:val="1"/>
     </w:lvlOverride>
   </w:num>
-  <w:num w:numId="1005">
+  <w:num w:numId="1006">
+    <w:abstractNumId w:val="99411"/>
+    <w:lvlOverride w:ilvl="0">
+      <w:startOverride w:val="1"/>
+    </w:lvlOverride>
+    <w:lvlOverride w:ilvl="1">
+      <w:startOverride w:val="1"/>
+    </w:lvlOverride>
+    <w:lvlOverride w:ilvl="2">
+      <w:startOverride w:val="1"/>
+    </w:lvlOverride>
+    <w:lvlOverride w:ilvl="3">
+      <w:startOverride w:val="1"/>
+    </w:lvlOverride>
+    <w:lvlOverride w:ilvl="4">
+      <w:startOverride w:val="1"/>
+    </w:lvlOverride>
+    <w:lvlOverride w:ilvl="5">
+      <w:startOverride w:val="1"/>
+    </w:lvlOverride>
+    <w:lvlOverride w:ilvl="6">
+      <w:startOverride w:val="1"/>
+    </w:lvlOverride>
+    <w:lvlOverride w:ilvl="7">
+      <w:startOverride w:val="1"/>
+    </w:lvlOverride>
+    <w:lvlOverride w:ilvl="8">
+      <w:startOverride w:val="1"/>
+    </w:lvlOverride>
+  </w:num>
+  <w:num w:numId="1007">
+    <w:abstractNumId w:val="99411"/>
+    <w:lvlOverride w:ilvl="0">
+      <w:startOverride w:val="1"/>
+    </w:lvlOverride>
+    <w:lvlOverride w:ilvl="1">
+      <w:startOverride w:val="1"/>
+    </w:lvlOverride>
+    <w:lvlOverride w:ilvl="2">
+      <w:startOverride w:val="1"/>
+    </w:lvlOverride>
+    <w:lvlOverride w:ilvl="3">
+      <w:startOverride w:val="1"/>
+    </w:lvlOverride>
+    <w:lvlOverride w:ilvl="4">
+      <w:startOverride w:val="1"/>
+    </w:lvlOverride>
+    <w:lvlOverride w:ilvl="5">
+      <w:startOverride w:val="1"/>
+    </w:lvlOverride>
+    <w:lvlOverride w:ilvl="6">
+      <w:startOverride w:val="1"/>
+    </w:lvlOverride>
+    <w:lvlOverride w:ilvl="7">
+      <w:startOverride w:val="1"/>
+    </w:lvlOverride>
+    <w:lvlOverride w:ilvl="8">
+      <w:startOverride w:val="1"/>
+    </w:lvlOverride>
+  </w:num>
+  <w:num w:numId="1008">
     <w:abstractNumId w:val="991"/>
   </w:num>
-  <w:num w:numId="1006">
+  <w:num w:numId="1009">
     <w:abstractNumId w:val="991"/>
+  </w:num>
+  <w:num w:numId="1010">
+    <w:abstractNumId w:val="99411"/>
+    <w:lvlOverride w:ilvl="0">
+      <w:startOverride w:val="1"/>
+    </w:lvlOverride>
+    <w:lvlOverride w:ilvl="1">
+      <w:startOverride w:val="1"/>
+    </w:lvlOverride>
+    <w:lvlOverride w:ilvl="2">
+      <w:startOverride w:val="1"/>
+    </w:lvlOverride>
+    <w:lvlOverride w:ilvl="3">
+      <w:startOverride w:val="1"/>
+    </w:lvlOverride>
+    <w:lvlOverride w:ilvl="4">
+      <w:startOverride w:val="1"/>
+    </w:lvlOverride>
+    <w:lvlOverride w:ilvl="5">
+      <w:startOverride w:val="1"/>
+    </w:lvlOverride>
+    <w:lvlOverride w:ilvl="6">
+      <w:startOverride w:val="1"/>
+    </w:lvlOverride>
+    <w:lvlOverride w:ilvl="7">
+      <w:startOverride w:val="1"/>
+    </w:lvlOverride>
+    <w:lvlOverride w:ilvl="8">
+      <w:startOverride w:val="1"/>
+    </w:lvlOverride>
   </w:num>
 </w:numbering>
 </file>

</xml_diff>

<commit_message>
Report: add group names and date
Co-Authored-By: Claude Opus 5.5 <noreply@anthropic.com>
Claude-Session: https://claude.ai/code/session_014ocBApjQjQLvNFavUdK8Yx
</commit_message>
<xml_diff>
--- a/linux-lab/Linux_Lab_Report.docx
+++ b/linux-lab/Linux_Lab_Report.docx
@@ -53,7 +53,7 @@
         <w:t xml:space="preserve"> </w:t>
       </w:r>
       <w:r>
-        <w:t xml:space="preserve">[DATE]</w:t>
+        <w:t xml:space="preserve">2026-10-16</w:t>
       </w:r>
     </w:p>
     <w:tbl>
@@ -64,8 +64,7 @@
         <w:jc w:val="start"/>
       </w:tblPr>
       <w:tblGrid>
-        <w:gridCol w:w="3960"/>
-        <w:gridCol w:w="3960"/>
+        <w:gridCol w:w="7920"/>
       </w:tblGrid>
       <w:tr>
         <w:trPr>
@@ -79,19 +78,7 @@
               <w:jc w:val="left"/>
             </w:pPr>
             <w:r>
-              <w:t xml:space="preserve">Student</w:t>
-            </w:r>
-          </w:p>
-        </w:tc>
-        <w:tc>
-          <w:tcPr/>
-          <w:p>
-            <w:pPr>
-              <w:pStyle w:val="Compact"/>
-              <w:jc w:val="left"/>
-            </w:pPr>
-            <w:r>
-              <w:t xml:space="preserve">DU-ID</w:t>
+              <w:t xml:space="preserve">Students</w:t>
             </w:r>
           </w:p>
         </w:tc>
@@ -105,19 +92,7 @@
               <w:jc w:val="left"/>
             </w:pPr>
             <w:r>
-              <w:t xml:space="preserve">Bilal [Last name]</w:t>
-            </w:r>
-          </w:p>
-        </w:tc>
-        <w:tc>
-          <w:tcPr/>
-          <w:p>
-            <w:pPr>
-              <w:pStyle w:val="Compact"/>
-              <w:jc w:val="left"/>
-            </w:pPr>
-            <w:r>
-              <w:t xml:space="preserve">[DU-ID]</w:t>
+              <w:t xml:space="preserve">Ali Hasan</w:t>
             </w:r>
           </w:p>
         </w:tc>
@@ -131,19 +106,7 @@
               <w:jc w:val="left"/>
             </w:pPr>
             <w:r>
-              <w:t xml:space="preserve">Ali [Last name]</w:t>
-            </w:r>
-          </w:p>
-        </w:tc>
-        <w:tc>
-          <w:tcPr/>
-          <w:p>
-            <w:pPr>
-              <w:pStyle w:val="Compact"/>
-              <w:jc w:val="left"/>
-            </w:pPr>
-            <w:r>
-              <w:t xml:space="preserve">[DU-ID]</w:t>
+              <w:t xml:space="preserve">Bilal Ahmed Adem</w:t>
             </w:r>
           </w:p>
         </w:tc>
@@ -157,19 +120,7 @@
               <w:jc w:val="left"/>
             </w:pPr>
             <w:r>
-              <w:t xml:space="preserve">Merat [Last name]</w:t>
-            </w:r>
-          </w:p>
-        </w:tc>
-        <w:tc>
-          <w:tcPr/>
-          <w:p>
-            <w:pPr>
-              <w:pStyle w:val="Compact"/>
-              <w:jc w:val="left"/>
-            </w:pPr>
-            <w:r>
-              <w:t xml:space="preserve">[DU-ID]</w:t>
+              <w:t xml:space="preserve">Hussein Mustafa</w:t>
             </w:r>
           </w:p>
         </w:tc>
@@ -183,19 +134,7 @@
               <w:jc w:val="left"/>
             </w:pPr>
             <w:r>
-              <w:t xml:space="preserve">Hussein [Last name]</w:t>
-            </w:r>
-          </w:p>
-        </w:tc>
-        <w:tc>
-          <w:tcPr/>
-          <w:p>
-            <w:pPr>
-              <w:pStyle w:val="Compact"/>
-              <w:jc w:val="left"/>
-            </w:pPr>
-            <w:r>
-              <w:t xml:space="preserve">[DU-ID]</w:t>
+              <w:t xml:space="preserve">Merat Bakoyan</w:t>
             </w:r>
           </w:p>
         </w:tc>
@@ -216,7 +155,7 @@
         <w:t xml:space="preserve"> </w:t>
       </w:r>
       <w:r>
-        <w:t xml:space="preserve">[YouTube link]</w:t>
+        <w:t xml:space="preserve">uploaded separately on Canvas</w:t>
       </w:r>
     </w:p>
     <w:bookmarkEnd w:id="20"/>

</xml_diff>